<commit_message>
Add PX-119 count-dependence evidence and illustrated Praxis delivery packages
</commit_message>
<xml_diff>
--- a/output/doc/aivh_praxis/Gary_Pagan_AI_Operator_Praxis.docx
+++ b/output/doc/aivh_praxis/Gary_Pagan_AI_Operator_Praxis.docx
@@ -72,7 +72,7 @@
         <w:spacing w:before="0" w:after="120"/>
         <w:rPr/>
       </w:pPr>
-      <w:bookmarkStart w:id="0" w:name="__RefHeading___Toc3448_1352511746"/>
+      <w:bookmarkStart w:id="0" w:name="__RefHeading___Toc8186_1352511746"/>
       <w:bookmarkEnd w:id="0"/>
       <w:r>
         <w:rPr/>
@@ -139,7 +139,7 @@
         <w:spacing w:before="0" w:after="120"/>
         <w:rPr/>
       </w:pPr>
-      <w:bookmarkStart w:id="1" w:name="__RefHeading___Toc3450_1352511746"/>
+      <w:bookmarkStart w:id="1" w:name="__RefHeading___Toc8188_1352511746"/>
       <w:bookmarkEnd w:id="1"/>
       <w:r>
         <w:rPr/>
@@ -230,7 +230,7 @@
             </w:rPr>
             <w:fldChar w:fldCharType="separate"/>
           </w:r>
-          <w:hyperlink w:anchor="__RefHeading___Toc3448_1352511746" w:tooltip="Abstract of Praxis">
+          <w:hyperlink w:anchor="__RefHeading___Toc8186_1352511746" w:tooltip="Abstract of Praxis">
             <w:r>
               <w:rPr>
                 <w:rStyle w:val="IndexLink"/>
@@ -250,7 +250,7 @@
             </w:tabs>
             <w:rPr/>
           </w:pPr>
-          <w:hyperlink w:anchor="__RefHeading___Toc3450_1352511746" w:tooltip="Manuscript Status and Research Transparency">
+          <w:hyperlink w:anchor="__RefHeading___Toc8188_1352511746" w:tooltip="Manuscript Status and Research Transparency">
             <w:r>
               <w:rPr>
                 <w:rStyle w:val="IndexLink"/>
@@ -270,7 +270,7 @@
             </w:tabs>
             <w:rPr/>
           </w:pPr>
-          <w:hyperlink w:anchor="__RefHeading___Toc3452_1352511746" w:tooltip="List of Acronyms and Terms">
+          <w:hyperlink w:anchor="__RefHeading___Toc8190_1352511746" w:tooltip="List of Acronyms and Terms">
             <w:r>
               <w:rPr>
                 <w:rStyle w:val="IndexLink"/>
@@ -290,7 +290,7 @@
             </w:tabs>
             <w:rPr/>
           </w:pPr>
-          <w:hyperlink w:anchor="__RefHeading___Toc3454_1352511746" w:tooltip="Chapter 1: Introduction">
+          <w:hyperlink w:anchor="__RefHeading___Toc8192_1352511746" w:tooltip="Chapter 1: Introduction">
             <w:r>
               <w:rPr>
                 <w:rStyle w:val="IndexLink"/>
@@ -310,7 +310,7 @@
             </w:tabs>
             <w:rPr/>
           </w:pPr>
-          <w:hyperlink w:anchor="__RefHeading___Toc3456_1352511746" w:tooltip="1.1 Background and motivation">
+          <w:hyperlink w:anchor="__RefHeading___Toc8194_1352511746" w:tooltip="1.1 Background and motivation">
             <w:r>
               <w:rPr>
                 <w:rStyle w:val="IndexLink"/>
@@ -330,7 +330,7 @@
             </w:tabs>
             <w:rPr/>
           </w:pPr>
-          <w:hyperlink w:anchor="__RefHeading___Toc3458_1352511746" w:tooltip="1.2 Problem statement">
+          <w:hyperlink w:anchor="__RefHeading___Toc8196_1352511746" w:tooltip="1.2 Problem statement">
             <w:r>
               <w:rPr>
                 <w:rStyle w:val="IndexLink"/>
@@ -350,7 +350,7 @@
             </w:tabs>
             <w:rPr/>
           </w:pPr>
-          <w:hyperlink w:anchor="__RefHeading___Toc3460_1352511746" w:tooltip="1.3 Purpose and proposed thesis">
+          <w:hyperlink w:anchor="__RefHeading___Toc8198_1352511746" w:tooltip="1.3 Purpose and proposed thesis">
             <w:r>
               <w:rPr>
                 <w:rStyle w:val="IndexLink"/>
@@ -370,7 +370,7 @@
             </w:tabs>
             <w:rPr/>
           </w:pPr>
-          <w:hyperlink w:anchor="__RefHeading___Toc3462_1352511746" w:tooltip="1.4 Practical impact">
+          <w:hyperlink w:anchor="__RefHeading___Toc8200_1352511746" w:tooltip="1.4 Practical impact">
             <w:r>
               <w:rPr>
                 <w:rStyle w:val="IndexLink"/>
@@ -390,7 +390,7 @@
             </w:tabs>
             <w:rPr/>
           </w:pPr>
-          <w:hyperlink w:anchor="__RefHeading___Toc3464_1352511746" w:tooltip="1.5 Research questions and hypotheses">
+          <w:hyperlink w:anchor="__RefHeading___Toc8202_1352511746" w:tooltip="1.5 Research questions and hypotheses">
             <w:r>
               <w:rPr>
                 <w:rStyle w:val="IndexLink"/>
@@ -410,7 +410,7 @@
             </w:tabs>
             <w:rPr/>
           </w:pPr>
-          <w:hyperlink w:anchor="__RefHeading___Toc3466_1352511746" w:tooltip="1.6 Scope and limitations">
+          <w:hyperlink w:anchor="__RefHeading___Toc8204_1352511746" w:tooltip="1.6 Scope and limitations">
             <w:r>
               <w:rPr>
                 <w:rStyle w:val="IndexLink"/>
@@ -418,6 +418,26 @@
               <w:t>1.6 Scope and limitations</w:t>
               <w:tab/>
               <w:t>3</w:t>
+            </w:r>
+          </w:hyperlink>
+        </w:p>
+        <w:p>
+          <w:pPr>
+            <w:pStyle w:val="TOC2"/>
+            <w:tabs>
+              <w:tab w:val="clear" w:pos="8357"/>
+              <w:tab w:val="right" w:pos="8639" w:leader="dot"/>
+            </w:tabs>
+            <w:rPr/>
+          </w:pPr>
+          <w:hyperlink w:anchor="__RefHeading___Toc8206_1352511746" w:tooltip="1.7 Objectives and organization">
+            <w:r>
+              <w:rPr>
+                <w:rStyle w:val="IndexLink"/>
+              </w:rPr>
+              <w:t>1.7 Objectives and organization</w:t>
+              <w:tab/>
+              <w:t>4</w:t>
             </w:r>
           </w:hyperlink>
         </w:p>
@@ -430,14 +450,14 @@
             </w:tabs>
             <w:rPr/>
           </w:pPr>
-          <w:hyperlink w:anchor="__RefHeading___Toc3468_1352511746" w:tooltip="Chapter 2: Literature Review">
+          <w:hyperlink w:anchor="__RefHeading___Toc8208_1352511746" w:tooltip="Chapter 2: Literature Review">
             <w:r>
               <w:rPr>
                 <w:rStyle w:val="IndexLink"/>
               </w:rPr>
               <w:t>Chapter 2: Literature Review</w:t>
               <w:tab/>
-              <w:t>4</w:t>
+              <w:t>5</w:t>
             </w:r>
           </w:hyperlink>
         </w:p>
@@ -450,14 +470,14 @@
             </w:tabs>
             <w:rPr/>
           </w:pPr>
-          <w:hyperlink w:anchor="__RefHeading___Toc3470_1352511746" w:tooltip="2.1 Closest technical precedent">
+          <w:hyperlink w:anchor="__RefHeading___Toc8210_1352511746" w:tooltip="2.1 Closest technical precedent">
             <w:r>
               <w:rPr>
                 <w:rStyle w:val="IndexLink"/>
               </w:rPr>
               <w:t>2.1 Closest technical precedent</w:t>
               <w:tab/>
-              <w:t>4</w:t>
+              <w:t>5</w:t>
             </w:r>
           </w:hyperlink>
         </w:p>
@@ -470,14 +490,14 @@
             </w:tabs>
             <w:rPr/>
           </w:pPr>
-          <w:hyperlink w:anchor="__RefHeading___Toc3472_1352511746" w:tooltip="2.2 Command behavior and environmental influence">
+          <w:hyperlink w:anchor="__RefHeading___Toc8212_1352511746" w:tooltip="2.2 Command behavior and environmental influence">
             <w:r>
               <w:rPr>
                 <w:rStyle w:val="IndexLink"/>
               </w:rPr>
               <w:t>2.2 Command behavior and environmental influence</w:t>
               <w:tab/>
-              <w:t>4</w:t>
+              <w:t>5</w:t>
             </w:r>
           </w:hyperlink>
         </w:p>
@@ -490,14 +510,14 @@
             </w:tabs>
             <w:rPr/>
           </w:pPr>
-          <w:hyperlink w:anchor="__RefHeading___Toc3474_1352511746" w:tooltip="2.3 Active detection and source qualification">
+          <w:hyperlink w:anchor="__RefHeading___Toc8214_1352511746" w:tooltip="2.3 Active detection and source qualification">
             <w:r>
               <w:rPr>
                 <w:rStyle w:val="IndexLink"/>
               </w:rPr>
               <w:t>2.3 Active detection and source qualification</w:t>
               <w:tab/>
-              <w:t>4</w:t>
+              <w:t>5</w:t>
             </w:r>
           </w:hyperlink>
         </w:p>
@@ -510,14 +530,14 @@
             </w:tabs>
             <w:rPr/>
           </w:pPr>
-          <w:hyperlink w:anchor="__RefHeading___Toc3476_1352511746" w:tooltip="2.4 Human command evidence">
+          <w:hyperlink w:anchor="__RefHeading___Toc8216_1352511746" w:tooltip="2.4 Human command evidence">
             <w:r>
               <w:rPr>
                 <w:rStyle w:val="IndexLink"/>
               </w:rPr>
               <w:t>2.4 Human command evidence</w:t>
               <w:tab/>
-              <w:t>5</w:t>
+              <w:t>6</w:t>
             </w:r>
           </w:hyperlink>
         </w:p>
@@ -530,14 +550,14 @@
             </w:tabs>
             <w:rPr/>
           </w:pPr>
-          <w:hyperlink w:anchor="__RefHeading___Toc3478_1352511746" w:tooltip="2.5 Explainability and the proposed gap">
+          <w:hyperlink w:anchor="__RefHeading___Toc8218_1352511746" w:tooltip="2.5 Explainability and the proposed gap">
             <w:r>
               <w:rPr>
                 <w:rStyle w:val="IndexLink"/>
               </w:rPr>
               <w:t>2.5 Explainability and the proposed gap</w:t>
               <w:tab/>
-              <w:t>5</w:t>
+              <w:t>6</w:t>
             </w:r>
           </w:hyperlink>
         </w:p>
@@ -550,14 +570,14 @@
             </w:tabs>
             <w:rPr/>
           </w:pPr>
-          <w:hyperlink w:anchor="__RefHeading___Toc3480_1352511746" w:tooltip="Chapter 3: Research Methodology">
+          <w:hyperlink w:anchor="__RefHeading___Toc8220_1352511746" w:tooltip="Chapter 3: Research Methodology">
             <w:r>
               <w:rPr>
                 <w:rStyle w:val="IndexLink"/>
               </w:rPr>
               <w:t>Chapter 3: Research Methodology</w:t>
               <w:tab/>
-              <w:t>7</w:t>
+              <w:t>8</w:t>
             </w:r>
           </w:hyperlink>
         </w:p>
@@ -570,14 +590,14 @@
             </w:tabs>
             <w:rPr/>
           </w:pPr>
-          <w:hyperlink w:anchor="__RefHeading___Toc3482_1352511746" w:tooltip="3.1 Study design in simple terms">
+          <w:hyperlink w:anchor="__RefHeading___Toc8222_1352511746" w:tooltip="3.1 Study design in simple terms">
             <w:r>
               <w:rPr>
                 <w:rStyle w:val="IndexLink"/>
               </w:rPr>
               <w:t>3.1 Study design in simple terms</w:t>
               <w:tab/>
-              <w:t>7</w:t>
+              <w:t>8</w:t>
             </w:r>
           </w:hyperlink>
         </w:p>
@@ -590,14 +610,14 @@
             </w:tabs>
             <w:rPr/>
           </w:pPr>
-          <w:hyperlink w:anchor="__RefHeading___Toc3484_1352511746" w:tooltip="3.2 Data qualification and observation unit">
+          <w:hyperlink w:anchor="__RefHeading___Toc8224_1352511746" w:tooltip="3.2 Data qualification and observation unit">
             <w:r>
               <w:rPr>
                 <w:rStyle w:val="IndexLink"/>
               </w:rPr>
               <w:t>3.2 Data qualification and observation unit</w:t>
               <w:tab/>
-              <w:t>7</w:t>
+              <w:t>9</w:t>
             </w:r>
           </w:hyperlink>
         </w:p>
@@ -610,14 +630,14 @@
             </w:tabs>
             <w:rPr/>
           </w:pPr>
-          <w:hyperlink w:anchor="__RefHeading___Toc3486_1352511746" w:tooltip="3.3 Models and controlled comparisons">
+          <w:hyperlink w:anchor="__RefHeading___Toc8226_1352511746" w:tooltip="3.2.1 Dataset evaluation">
             <w:r>
               <w:rPr>
                 <w:rStyle w:val="IndexLink"/>
               </w:rPr>
-              <w:t>3.3 Models and controlled comparisons</w:t>
+              <w:t>3.2.1 Dataset evaluation</w:t>
               <w:tab/>
-              <w:t>8</w:t>
+              <w:t>10</w:t>
             </w:r>
           </w:hyperlink>
         </w:p>
@@ -630,14 +650,14 @@
             </w:tabs>
             <w:rPr/>
           </w:pPr>
-          <w:hyperlink w:anchor="__RefHeading___Toc3488_1352511746" w:tooltip="3.4 Thresholds, metrics and uncertainty">
+          <w:hyperlink w:anchor="__RefHeading___Toc8228_1352511746" w:tooltip="3.2.2 Observation point and practical meaning">
             <w:r>
               <w:rPr>
                 <w:rStyle w:val="IndexLink"/>
               </w:rPr>
-              <w:t>3.4 Thresholds, metrics and uncertainty</w:t>
+              <w:t>3.2.2 Observation point and practical meaning</w:t>
               <w:tab/>
-              <w:t>9</w:t>
+              <w:t>11</w:t>
             </w:r>
           </w:hyperlink>
         </w:p>
@@ -650,14 +670,14 @@
             </w:tabs>
             <w:rPr/>
           </w:pPr>
-          <w:hyperlink w:anchor="__RefHeading___Toc3490_1352511746" w:tooltip="3.5 Explanation and perturbation tests">
+          <w:hyperlink w:anchor="__RefHeading___Toc8230_1352511746" w:tooltip="3.3 Models and controlled comparisons">
             <w:r>
               <w:rPr>
                 <w:rStyle w:val="IndexLink"/>
               </w:rPr>
-              <w:t>3.5 Explanation and perturbation tests</w:t>
+              <w:t>3.3 Models and controlled comparisons</w:t>
               <w:tab/>
-              <w:t>9</w:t>
+              <w:t>12</w:t>
             </w:r>
           </w:hyperlink>
         </w:p>
@@ -670,14 +690,14 @@
             </w:tabs>
             <w:rPr/>
           </w:pPr>
-          <w:hyperlink w:anchor="__RefHeading___Toc3492_1352511746" w:tooltip="3.6 Independent-source probe">
+          <w:hyperlink w:anchor="__RefHeading___Toc8232_1352511746" w:tooltip="3.4 Thresholds, metrics and uncertainty">
             <w:r>
               <w:rPr>
                 <w:rStyle w:val="IndexLink"/>
               </w:rPr>
-              <w:t>3.6 Independent-source probe</w:t>
+              <w:t>3.4 Thresholds, metrics and uncertainty</w:t>
               <w:tab/>
-              <w:t>10</w:t>
+              <w:t>12</w:t>
             </w:r>
           </w:hyperlink>
         </w:p>
@@ -690,14 +710,14 @@
             </w:tabs>
             <w:rPr/>
           </w:pPr>
-          <w:hyperlink w:anchor="__RefHeading___Toc3494_1352511746" w:tooltip="3.7 Matched collection and feasibility">
+          <w:hyperlink w:anchor="__RefHeading___Toc8234_1352511746" w:tooltip="3.5 Explanation and perturbation tests">
             <w:r>
               <w:rPr>
                 <w:rStyle w:val="IndexLink"/>
               </w:rPr>
-              <w:t>3.7 Matched collection and feasibility</w:t>
+              <w:t>3.5 Explanation and perturbation tests</w:t>
               <w:tab/>
-              <w:t>10</w:t>
+              <w:t>13</w:t>
             </w:r>
           </w:hyperlink>
         </w:p>
@@ -710,14 +730,94 @@
             </w:tabs>
             <w:rPr/>
           </w:pPr>
-          <w:hyperlink w:anchor="__RefHeading___Toc3496_1352511746" w:tooltip="3.8 Reproducibility and stopping rules">
+          <w:hyperlink w:anchor="__RefHeading___Toc8236_1352511746" w:tooltip="3.6 Independent-source probe">
+            <w:r>
+              <w:rPr>
+                <w:rStyle w:val="IndexLink"/>
+              </w:rPr>
+              <w:t>3.6 Independent-source probe</w:t>
+              <w:tab/>
+              <w:t>14</w:t>
+            </w:r>
+          </w:hyperlink>
+        </w:p>
+        <w:p>
+          <w:pPr>
+            <w:pStyle w:val="TOC2"/>
+            <w:tabs>
+              <w:tab w:val="clear" w:pos="8357"/>
+              <w:tab w:val="right" w:pos="8639" w:leader="dot"/>
+            </w:tabs>
+            <w:rPr/>
+          </w:pPr>
+          <w:hyperlink w:anchor="__RefHeading___Toc8238_1352511746" w:tooltip="3.7 Matched collection and feasibility">
+            <w:r>
+              <w:rPr>
+                <w:rStyle w:val="IndexLink"/>
+              </w:rPr>
+              <w:t>3.7 Matched collection and feasibility</w:t>
+              <w:tab/>
+              <w:t>14</w:t>
+            </w:r>
+          </w:hyperlink>
+        </w:p>
+        <w:p>
+          <w:pPr>
+            <w:pStyle w:val="TOC2"/>
+            <w:tabs>
+              <w:tab w:val="clear" w:pos="8357"/>
+              <w:tab w:val="right" w:pos="8639" w:leader="dot"/>
+            </w:tabs>
+            <w:rPr/>
+          </w:pPr>
+          <w:hyperlink w:anchor="__RefHeading___Toc8240_1352511746" w:tooltip="3.8 Reproducibility and stopping rules">
             <w:r>
               <w:rPr>
                 <w:rStyle w:val="IndexLink"/>
               </w:rPr>
               <w:t>3.8 Reproducibility and stopping rules</w:t>
               <w:tab/>
-              <w:t>11</w:t>
+              <w:t>15</w:t>
+            </w:r>
+          </w:hyperlink>
+        </w:p>
+        <w:p>
+          <w:pPr>
+            <w:pStyle w:val="TOC2"/>
+            <w:tabs>
+              <w:tab w:val="clear" w:pos="8357"/>
+              <w:tab w:val="right" w:pos="8639" w:leader="dot"/>
+            </w:tabs>
+            <w:rPr/>
+          </w:pPr>
+          <w:hyperlink w:anchor="__RefHeading___Toc8242_1352511746" w:tooltip="3.9 Graphical methodology representation (GMR)">
+            <w:r>
+              <w:rPr>
+                <w:rStyle w:val="IndexLink"/>
+              </w:rPr>
+              <w:t>3.9 Graphical methodology representation (GMR)</w:t>
+              <w:tab/>
+              <w:t>16</w:t>
+            </w:r>
+          </w:hyperlink>
+        </w:p>
+        <w:p>
+          <w:pPr>
+            <w:pStyle w:val="TOC2"/>
+            <w:tabs>
+              <w:tab w:val="clear" w:pos="8357"/>
+              <w:tab w:val="right" w:pos="8639" w:leader="dot"/>
+            </w:tabs>
+            <w:rPr/>
+          </w:pPr>
+          <w:hyperlink w:anchor="__RefHeading___Toc8244_1352511746" w:tooltip="3.10 Additional development test: PX-119">
+            <w:r>
+              <w:rPr>
+                <w:rStyle w:val="IndexLink"/>
+              </w:rPr>
+              <w:t>3.10 Additional development test: PX-119</w:t>
+              <w:tab/>
+              <w:t>16</w:t>
             </w:r>
           </w:hyperlink>
         </w:p>
@@ -730,14 +830,14 @@
             </w:tabs>
             <w:rPr/>
           </w:pPr>
-          <w:hyperlink w:anchor="__RefHeading___Toc3498_1352511746" w:tooltip="Chapter 4: Completed Development Results">
+          <w:hyperlink w:anchor="__RefHeading___Toc8246_1352511746" w:tooltip="Chapter 4: Completed Development Results">
             <w:r>
               <w:rPr>
                 <w:rStyle w:val="IndexLink"/>
               </w:rPr>
               <w:t>Chapter 4: Completed Development Results</w:t>
               <w:tab/>
-              <w:t>12</w:t>
+              <w:t>17</w:t>
             </w:r>
           </w:hyperlink>
         </w:p>
@@ -750,14 +850,14 @@
             </w:tabs>
             <w:rPr/>
           </w:pPr>
-          <w:hyperlink w:anchor="__RefHeading___Toc3500_1352511746" w:tooltip="4.1 Preliminary PX-117C evidence">
+          <w:hyperlink w:anchor="__RefHeading___Toc8248_1352511746" w:tooltip="4.1 Preliminary PX-117C evidence">
             <w:r>
               <w:rPr>
                 <w:rStyle w:val="IndexLink"/>
               </w:rPr>
               <w:t>4.1 Preliminary PX-117C evidence</w:t>
               <w:tab/>
-              <w:t>12</w:t>
+              <w:t>17</w:t>
             </w:r>
           </w:hyperlink>
         </w:p>
@@ -770,14 +870,14 @@
             </w:tabs>
             <w:rPr/>
           </w:pPr>
-          <w:hyperlink w:anchor="__RefHeading___Toc3502_1352511746" w:tooltip="4.2 PX-118 paired model comparison">
+          <w:hyperlink w:anchor="__RefHeading___Toc8250_1352511746" w:tooltip="4.2 PX-118 paired model comparison">
             <w:r>
               <w:rPr>
                 <w:rStyle w:val="IndexLink"/>
               </w:rPr>
               <w:t>4.2 PX-118 paired model comparison</w:t>
               <w:tab/>
-              <w:t>12</w:t>
+              <w:t>17</w:t>
             </w:r>
           </w:hyperlink>
         </w:p>
@@ -790,14 +890,14 @@
             </w:tabs>
             <w:rPr/>
           </w:pPr>
-          <w:hyperlink w:anchor="__RefHeading___Toc3504_1352511746" w:tooltip="4.3 Argument removal and score explanations">
+          <w:hyperlink w:anchor="__RefHeading___Toc8252_1352511746" w:tooltip="4.3 Argument removal and score explanations">
             <w:r>
               <w:rPr>
                 <w:rStyle w:val="IndexLink"/>
               </w:rPr>
               <w:t>4.3 Argument removal and score explanations</w:t>
               <w:tab/>
-              <w:t>14</w:t>
+              <w:t>19</w:t>
             </w:r>
           </w:hyperlink>
         </w:p>
@@ -810,14 +910,14 @@
             </w:tabs>
             <w:rPr/>
           </w:pPr>
-          <w:hyperlink w:anchor="__RefHeading___Toc3506_1352511746" w:tooltip="4.4 External-source eligibility and outcomes">
+          <w:hyperlink w:anchor="__RefHeading___Toc8254_1352511746" w:tooltip="4.4 External-source eligibility and outcomes">
             <w:r>
               <w:rPr>
                 <w:rStyle w:val="IndexLink"/>
               </w:rPr>
               <w:t>4.4 External-source eligibility and outcomes</w:t>
               <w:tab/>
-              <w:t>15</w:t>
+              <w:t>20</w:t>
             </w:r>
           </w:hyperlink>
         </w:p>
@@ -830,14 +930,54 @@
             </w:tabs>
             <w:rPr/>
           </w:pPr>
-          <w:hyperlink w:anchor="__RefHeading___Toc3508_1352511746" w:tooltip="4.5 What remains untested">
+          <w:hyperlink w:anchor="__RefHeading___Toc8256_1352511746" w:tooltip="4.5 What remains untested">
             <w:r>
               <w:rPr>
                 <w:rStyle w:val="IndexLink"/>
               </w:rPr>
               <w:t>4.5 What remains untested</w:t>
               <w:tab/>
-              <w:t>15</w:t>
+              <w:t>20</w:t>
+            </w:r>
+          </w:hyperlink>
+        </w:p>
+        <w:p>
+          <w:pPr>
+            <w:pStyle w:val="TOC2"/>
+            <w:tabs>
+              <w:tab w:val="clear" w:pos="8357"/>
+              <w:tab w:val="right" w:pos="8639" w:leader="dot"/>
+            </w:tabs>
+            <w:rPr/>
+          </w:pPr>
+          <w:hyperlink w:anchor="__RefHeading___Toc8258_1352511746" w:tooltip="4.6 Argument-count dependence: PX-119">
+            <w:r>
+              <w:rPr>
+                <w:rStyle w:val="IndexLink"/>
+              </w:rPr>
+              <w:t>4.6 Argument-count dependence: PX-119</w:t>
+              <w:tab/>
+              <w:t>21</w:t>
+            </w:r>
+          </w:hyperlink>
+        </w:p>
+        <w:p>
+          <w:pPr>
+            <w:pStyle w:val="TOC2"/>
+            <w:tabs>
+              <w:tab w:val="clear" w:pos="8357"/>
+              <w:tab w:val="right" w:pos="8639" w:leader="dot"/>
+            </w:tabs>
+            <w:rPr/>
+          </w:pPr>
+          <w:hyperlink w:anchor="__RefHeading___Toc8260_1352511746" w:tooltip="4.7 Hypothesis status and practical interpretation">
+            <w:r>
+              <w:rPr>
+                <w:rStyle w:val="IndexLink"/>
+              </w:rPr>
+              <w:t>4.7 Hypothesis status and practical interpretation</w:t>
+              <w:tab/>
+              <w:t>22</w:t>
             </w:r>
           </w:hyperlink>
         </w:p>
@@ -850,14 +990,14 @@
             </w:tabs>
             <w:rPr/>
           </w:pPr>
-          <w:hyperlink w:anchor="__RefHeading___Toc3510_1352511746" w:tooltip="Chapter 5: Discussion and Conclusions">
+          <w:hyperlink w:anchor="__RefHeading___Toc8262_1352511746" w:tooltip="Chapter 5: Discussion and Conclusions">
             <w:r>
               <w:rPr>
                 <w:rStyle w:val="IndexLink"/>
               </w:rPr>
               <w:t>Chapter 5: Discussion and Conclusions</w:t>
               <w:tab/>
-              <w:t>16</w:t>
+              <w:t>23</w:t>
             </w:r>
           </w:hyperlink>
         </w:p>
@@ -870,14 +1010,14 @@
             </w:tabs>
             <w:rPr/>
           </w:pPr>
-          <w:hyperlink w:anchor="__RefHeading___Toc3512_1352511746" w:tooltip="5.1 Interpretation">
+          <w:hyperlink w:anchor="__RefHeading___Toc8264_1352511746" w:tooltip="5.1 Interpretation">
             <w:r>
               <w:rPr>
                 <w:rStyle w:val="IndexLink"/>
               </w:rPr>
               <w:t>5.1 Interpretation</w:t>
               <w:tab/>
-              <w:t>16</w:t>
+              <w:t>23</w:t>
             </w:r>
           </w:hyperlink>
         </w:p>
@@ -890,14 +1030,14 @@
             </w:tabs>
             <w:rPr/>
           </w:pPr>
-          <w:hyperlink w:anchor="__RefHeading___Toc3514_1352511746" w:tooltip="5.2 Engineering product and proposed contribution">
+          <w:hyperlink w:anchor="__RefHeading___Toc8266_1352511746" w:tooltip="5.2 Engineering product and proposed contribution">
             <w:r>
               <w:rPr>
                 <w:rStyle w:val="IndexLink"/>
               </w:rPr>
               <w:t>5.2 Engineering product and proposed contribution</w:t>
               <w:tab/>
-              <w:t>16</w:t>
+              <w:t>23</w:t>
             </w:r>
           </w:hyperlink>
         </w:p>
@@ -910,14 +1050,14 @@
             </w:tabs>
             <w:rPr/>
           </w:pPr>
-          <w:hyperlink w:anchor="__RefHeading___Toc3516_1352511746" w:tooltip="5.3 Decisions for the next phase">
+          <w:hyperlink w:anchor="__RefHeading___Toc8268_1352511746" w:tooltip="5.3 Decisions for the next phase">
             <w:r>
               <w:rPr>
                 <w:rStyle w:val="IndexLink"/>
               </w:rPr>
               <w:t>5.3 Decisions for the next phase</w:t>
               <w:tab/>
-              <w:t>17</w:t>
+              <w:t>24</w:t>
             </w:r>
           </w:hyperlink>
         </w:p>
@@ -930,14 +1070,34 @@
             </w:tabs>
             <w:rPr/>
           </w:pPr>
-          <w:hyperlink w:anchor="__RefHeading___Toc3518_1352511746" w:tooltip="5.4 Conclusion">
+          <w:hyperlink w:anchor="__RefHeading___Toc8270_1352511746" w:tooltip="5.4 Conclusion">
             <w:r>
               <w:rPr>
                 <w:rStyle w:val="IndexLink"/>
               </w:rPr>
               <w:t>5.4 Conclusion</w:t>
               <w:tab/>
-              <w:t>17</w:t>
+              <w:t>24</w:t>
+            </w:r>
+          </w:hyperlink>
+        </w:p>
+        <w:p>
+          <w:pPr>
+            <w:pStyle w:val="TOC2"/>
+            <w:tabs>
+              <w:tab w:val="clear" w:pos="8357"/>
+              <w:tab w:val="right" w:pos="8639" w:leader="dot"/>
+            </w:tabs>
+            <w:rPr/>
+          </w:pPr>
+          <w:hyperlink w:anchor="__RefHeading___Toc8272_1352511746" w:tooltip="5.5 Work remaining before a defense claim">
+            <w:r>
+              <w:rPr>
+                <w:rStyle w:val="IndexLink"/>
+              </w:rPr>
+              <w:t>5.5 Work remaining before a defense claim</w:t>
+              <w:tab/>
+              <w:t>25</w:t>
             </w:r>
           </w:hyperlink>
         </w:p>
@@ -950,14 +1110,14 @@
             </w:tabs>
             <w:rPr/>
           </w:pPr>
-          <w:hyperlink w:anchor="__RefHeading___Toc3520_1352511746" w:tooltip="References">
+          <w:hyperlink w:anchor="__RefHeading___Toc8274_1352511746" w:tooltip="References">
             <w:r>
               <w:rPr>
                 <w:rStyle w:val="IndexLink"/>
               </w:rPr>
               <w:t>References</w:t>
               <w:tab/>
-              <w:t>18</w:t>
+              <w:t>26</w:t>
             </w:r>
           </w:hyperlink>
         </w:p>
@@ -970,14 +1130,14 @@
             </w:tabs>
             <w:rPr/>
           </w:pPr>
-          <w:hyperlink w:anchor="__RefHeading___Toc3522_1352511746" w:tooltip="Appendix A: Evidence and Reproduction">
+          <w:hyperlink w:anchor="__RefHeading___Toc8276_1352511746" w:tooltip="Appendix A: Evidence and Reproduction">
             <w:r>
               <w:rPr>
                 <w:rStyle w:val="IndexLink"/>
               </w:rPr>
               <w:t>Appendix A: Evidence and Reproduction</w:t>
               <w:tab/>
-              <w:t>19</w:t>
+              <w:t>27</w:t>
             </w:r>
           </w:hyperlink>
         </w:p>
@@ -990,14 +1150,34 @@
             </w:tabs>
             <w:rPr/>
           </w:pPr>
-          <w:hyperlink w:anchor="__RefHeading___Toc3524_1352511746" w:tooltip="Appendix B: Committee Review Checklist">
+          <w:hyperlink w:anchor="__RefHeading___Toc8278_1352511746" w:tooltip="Appendix B: Committee Review Checklist">
             <w:r>
               <w:rPr>
                 <w:rStyle w:val="IndexLink"/>
               </w:rPr>
               <w:t>Appendix B: Committee Review Checklist</w:t>
               <w:tab/>
-              <w:t>20</w:t>
+              <w:t>28</w:t>
+            </w:r>
+          </w:hyperlink>
+        </w:p>
+        <w:p>
+          <w:pPr>
+            <w:pStyle w:val="TOC1"/>
+            <w:tabs>
+              <w:tab w:val="clear" w:pos="8640"/>
+              <w:tab w:val="right" w:pos="8639" w:leader="dot"/>
+            </w:tabs>
+            <w:rPr/>
+          </w:pPr>
+          <w:hyperlink w:anchor="__RefHeading___Toc8280_1352511746" w:tooltip="Appendix C: Package Guide and Research Disclosure">
+            <w:r>
+              <w:rPr>
+                <w:rStyle w:val="IndexLink"/>
+              </w:rPr>
+              <w:t>Appendix C: Package Guide and Research Disclosure</w:t>
+              <w:tab/>
+              <w:t>29</w:t>
             </w:r>
           </w:hyperlink>
           <w:r>
@@ -1073,14 +1253,54 @@
             </w:rPr>
             <w:fldChar w:fldCharType="separate"/>
           </w:r>
-          <w:hyperlink w:anchor="__RefHeading___Toc3527_1352511746" w:tooltip="Figure 1. Command-attribution study workflow">
+          <w:hyperlink w:anchor="__RefHeading___Toc8283_1352511746" w:tooltip="Figure 1. Current development data and required matched evaluation">
             <w:r>
               <w:rPr>
                 <w:rStyle w:val="IndexLink"/>
               </w:rPr>
-              <w:t>Figure 1. Command-attribution study workflow</w:t>
+              <w:t>Figure 1. Current development data and required matched evaluation</w:t>
               <w:tab/>
-              <w:t>7</w:t>
+              <w:t>8</w:t>
+            </w:r>
+          </w:hyperlink>
+        </w:p>
+        <w:p>
+          <w:pPr>
+            <w:pStyle w:val="TOC1"/>
+            <w:tabs>
+              <w:tab w:val="clear" w:pos="8640"/>
+              <w:tab w:val="right" w:pos="8639" w:leader="dot"/>
+            </w:tabs>
+            <w:rPr/>
+          </w:pPr>
+          <w:hyperlink w:anchor="__RefHeading___Toc8287_1352511746" w:tooltip="Figure 2. GMR: what is tested, why it matters and how it is evaluated">
+            <w:r>
+              <w:rPr>
+                <w:rStyle w:val="IndexLink"/>
+              </w:rPr>
+              <w:t>Figure 2. GMR: what is tested, why it matters and how it is evaluated</w:t>
+              <w:tab/>
+              <w:t>16</w:t>
+            </w:r>
+          </w:hyperlink>
+        </w:p>
+        <w:p>
+          <w:pPr>
+            <w:pStyle w:val="TOC1"/>
+            <w:tabs>
+              <w:tab w:val="clear" w:pos="8640"/>
+              <w:tab w:val="right" w:pos="8639" w:leader="dot"/>
+            </w:tabs>
+            <w:rPr/>
+          </w:pPr>
+          <w:hyperlink w:anchor="__RefHeading___Toc8285_1352511746" w:tooltip="Figure 3. Argument-count intervention and retrained controls">
+            <w:r>
+              <w:rPr>
+                <w:rStyle w:val="IndexLink"/>
+              </w:rPr>
+              <w:t>Figure 3. Argument-count intervention and retrained controls</w:t>
+              <w:tab/>
+              <w:t>21</w:t>
             </w:r>
           </w:hyperlink>
           <w:r>
@@ -1156,14 +1376,14 @@
             </w:rPr>
             <w:fldChar w:fldCharType="separate"/>
           </w:r>
-          <w:hyperlink w:anchor="__RefHeading___Toc3530_1352511746" w:tooltip="Terms used in this manuscript">
+          <w:hyperlink w:anchor="__RefHeading___Toc8290_1352511746" w:tooltip="Table 1. Research alignment">
             <w:r>
               <w:rPr>
                 <w:rStyle w:val="IndexLink"/>
               </w:rPr>
-              <w:t>Terms used in this manuscript</w:t>
+              <w:t>Table 1. Research alignment</w:t>
               <w:tab/>
-              <w:t>viii</w:t>
+              <w:t>3</w:t>
             </w:r>
           </w:hyperlink>
         </w:p>
@@ -1176,14 +1396,14 @@
             </w:tabs>
             <w:rPr/>
           </w:pPr>
-          <w:hyperlink w:anchor="__RefHeading___Toc3548_1352511746" w:tooltip="Table 1. Research alignment">
+          <w:hyperlink w:anchor="__RefHeading___Toc8318_1352511746" w:tooltip="Table 2. Prior work and the candidate contribution">
             <w:r>
               <w:rPr>
                 <w:rStyle w:val="IndexLink"/>
               </w:rPr>
-              <w:t>Table 1. Research alignment</w:t>
+              <w:t>Table 2. Prior work and the candidate contribution</w:t>
               <w:tab/>
-              <w:t>3</w:t>
+              <w:t>7</w:t>
             </w:r>
           </w:hyperlink>
         </w:p>
@@ -1196,14 +1416,14 @@
             </w:tabs>
             <w:rPr/>
           </w:pPr>
-          <w:hyperlink w:anchor="__RefHeading___Toc3546_1352511746" w:tooltip="Table 2. Prior work and the candidate contribution">
+          <w:hyperlink w:anchor="__RefHeading___Toc8316_1352511746" w:tooltip="Table 3. What each dataset can support">
             <w:r>
               <w:rPr>
                 <w:rStyle w:val="IndexLink"/>
               </w:rPr>
-              <w:t>Table 2. Prior work and the candidate contribution</w:t>
+              <w:t>Table 3. What each dataset can support</w:t>
               <w:tab/>
-              <w:t>6</w:t>
+              <w:t>10</w:t>
             </w:r>
           </w:hyperlink>
         </w:p>
@@ -1216,14 +1436,14 @@
             </w:tabs>
             <w:rPr/>
           </w:pPr>
-          <w:hyperlink w:anchor="__RefHeading___Toc3544_1352511746" w:tooltip="Table 3. PX-118 model comparisons">
+          <w:hyperlink w:anchor="__RefHeading___Toc8314_1352511746" w:tooltip="Table 4. Command representation example (constructed illustration)">
             <w:r>
               <w:rPr>
                 <w:rStyle w:val="IndexLink"/>
               </w:rPr>
-              <w:t>Table 3. PX-118 model comparisons</w:t>
+              <w:t>Table 4. Command representation example (constructed illustration)</w:t>
               <w:tab/>
-              <w:t>8</w:t>
+              <w:t>10</w:t>
             </w:r>
           </w:hyperlink>
         </w:p>
@@ -1236,14 +1456,14 @@
             </w:tabs>
             <w:rPr/>
           </w:pPr>
-          <w:hyperlink w:anchor="__RefHeading___Toc3542_1352511746" w:tooltip="Table 4. PX-117C main operating points">
+          <w:hyperlink w:anchor="__RefHeading___Toc8312_1352511746" w:tooltip="Table 5. Actual normalized excerpts from development records">
             <w:r>
               <w:rPr>
                 <w:rStyle w:val="IndexLink"/>
               </w:rPr>
-              <w:t>Table 4. PX-117C main operating points</w:t>
+              <w:t>Table 5. Actual normalized excerpts from development records</w:t>
               <w:tab/>
-              <w:t>12</w:t>
+              <w:t>11</w:t>
             </w:r>
           </w:hyperlink>
         </w:p>
@@ -1256,12 +1476,12 @@
             </w:tabs>
             <w:rPr/>
           </w:pPr>
-          <w:hyperlink w:anchor="__RefHeading___Toc3540_1352511746" w:tooltip="Table 5. PX-118 main development results">
+          <w:hyperlink w:anchor="__RefHeading___Toc8310_1352511746" w:tooltip="Table 6. PX-118 model comparisons">
             <w:r>
               <w:rPr>
                 <w:rStyle w:val="IndexLink"/>
               </w:rPr>
-              <w:t>Table 5. PX-118 main development results</w:t>
+              <w:t>Table 6. PX-118 model comparisons</w:t>
               <w:tab/>
               <w:t>12</w:t>
             </w:r>
@@ -1276,14 +1496,14 @@
             </w:tabs>
             <w:rPr/>
           </w:pPr>
-          <w:hyperlink w:anchor="__RefHeading___Toc3538_1352511746" w:tooltip="Table 6. AI recall under held-out families">
+          <w:hyperlink w:anchor="__RefHeading___Toc8308_1352511746" w:tooltip="Table 7. PX-117C main operating points">
             <w:r>
               <w:rPr>
                 <w:rStyle w:val="IndexLink"/>
               </w:rPr>
-              <w:t>Table 6. AI recall under held-out families</w:t>
+              <w:t>Table 7. PX-117C main operating points</w:t>
               <w:tab/>
-              <w:t>13</w:t>
+              <w:t>17</w:t>
             </w:r>
           </w:hyperlink>
         </w:p>
@@ -1296,14 +1516,14 @@
             </w:tabs>
             <w:rPr/>
           </w:pPr>
-          <w:hyperlink w:anchor="__RefHeading___Toc3536_1352511746" w:tooltip="Table 7. Frozen-model argument-removal stress test">
+          <w:hyperlink w:anchor="__RefHeading___Toc8306_1352511746" w:tooltip="Table 8. PX-118 main development results">
             <w:r>
               <w:rPr>
                 <w:rStyle w:val="IndexLink"/>
               </w:rPr>
-              <w:t>Table 7. Frozen-model argument-removal stress test</w:t>
+              <w:t>Table 8. PX-118 main development results</w:t>
               <w:tab/>
-              <w:t>14</w:t>
+              <w:t>17</w:t>
             </w:r>
           </w:hyperlink>
         </w:p>
@@ -1316,14 +1536,14 @@
             </w:tabs>
             <w:rPr/>
           </w:pPr>
-          <w:hyperlink w:anchor="__RefHeading___Toc3534_1352511746" w:tooltip="Table 8. Rouxii qualification">
+          <w:hyperlink w:anchor="__RefHeading___Toc8304_1352511746" w:tooltip="Table 9. AI recall under held-out families">
             <w:r>
               <w:rPr>
                 <w:rStyle w:val="IndexLink"/>
               </w:rPr>
-              <w:t>Table 8. Rouxii qualification</w:t>
+              <w:t>Table 9. AI recall under held-out families</w:t>
               <w:tab/>
-              <w:t>15</w:t>
+              <w:t>18</w:t>
             </w:r>
           </w:hyperlink>
         </w:p>
@@ -1336,14 +1556,114 @@
             </w:tabs>
             <w:rPr/>
           </w:pPr>
-          <w:hyperlink w:anchor="__RefHeading___Toc3532_1352511746" w:tooltip="Table 9. Independent-source probes">
+          <w:hyperlink w:anchor="__RefHeading___Toc8302_1352511746" w:tooltip="Table 10. Frozen-model argument-removal stress test">
             <w:r>
               <w:rPr>
                 <w:rStyle w:val="IndexLink"/>
               </w:rPr>
-              <w:t>Table 9. Independent-source probes</w:t>
+              <w:t>Table 10. Frozen-model argument-removal stress test</w:t>
               <w:tab/>
-              <w:t>15</w:t>
+              <w:t>19</w:t>
+            </w:r>
+          </w:hyperlink>
+        </w:p>
+        <w:p>
+          <w:pPr>
+            <w:pStyle w:val="TOC1"/>
+            <w:tabs>
+              <w:tab w:val="clear" w:pos="8640"/>
+              <w:tab w:val="right" w:pos="8639" w:leader="dot"/>
+            </w:tabs>
+            <w:rPr/>
+          </w:pPr>
+          <w:hyperlink w:anchor="__RefHeading___Toc8300_1352511746" w:tooltip="Table 11. Rouxii qualification">
+            <w:r>
+              <w:rPr>
+                <w:rStyle w:val="IndexLink"/>
+              </w:rPr>
+              <w:t>Table 11. Rouxii qualification</w:t>
+              <w:tab/>
+              <w:t>20</w:t>
+            </w:r>
+          </w:hyperlink>
+        </w:p>
+        <w:p>
+          <w:pPr>
+            <w:pStyle w:val="TOC1"/>
+            <w:tabs>
+              <w:tab w:val="clear" w:pos="8640"/>
+              <w:tab w:val="right" w:pos="8639" w:leader="dot"/>
+            </w:tabs>
+            <w:rPr/>
+          </w:pPr>
+          <w:hyperlink w:anchor="__RefHeading___Toc8298_1352511746" w:tooltip="Table 12. Independent-source probes">
+            <w:r>
+              <w:rPr>
+                <w:rStyle w:val="IndexLink"/>
+              </w:rPr>
+              <w:t>Table 12. Independent-source probes</w:t>
+              <w:tab/>
+              <w:t>20</w:t>
+            </w:r>
+          </w:hyperlink>
+        </w:p>
+        <w:p>
+          <w:pPr>
+            <w:pStyle w:val="TOC1"/>
+            <w:tabs>
+              <w:tab w:val="clear" w:pos="8640"/>
+              <w:tab w:val="right" w:pos="8639" w:leader="dot"/>
+            </w:tabs>
+            <w:rPr/>
+          </w:pPr>
+          <w:hyperlink w:anchor="__RefHeading___Toc8296_1352511746" w:tooltip="Table 13. Argument-count diagnostic on the same development test">
+            <w:r>
+              <w:rPr>
+                <w:rStyle w:val="IndexLink"/>
+              </w:rPr>
+              <w:t>Table 13. Argument-count diagnostic on the same development test</w:t>
+              <w:tab/>
+              <w:t>21</w:t>
+            </w:r>
+          </w:hyperlink>
+        </w:p>
+        <w:p>
+          <w:pPr>
+            <w:pStyle w:val="TOC1"/>
+            <w:tabs>
+              <w:tab w:val="clear" w:pos="8640"/>
+              <w:tab w:val="right" w:pos="8639" w:leader="dot"/>
+            </w:tabs>
+            <w:rPr/>
+          </w:pPr>
+          <w:hyperlink w:anchor="__RefHeading___Toc8294_1352511746" w:tooltip="Table 14. Status of proposed confirmatory hypotheses">
+            <w:r>
+              <w:rPr>
+                <w:rStyle w:val="IndexLink"/>
+              </w:rPr>
+              <w:t>Table 14. Status of proposed confirmatory hypotheses</w:t>
+              <w:tab/>
+              <w:t>22</w:t>
+            </w:r>
+          </w:hyperlink>
+        </w:p>
+        <w:p>
+          <w:pPr>
+            <w:pStyle w:val="TOC1"/>
+            <w:tabs>
+              <w:tab w:val="clear" w:pos="8640"/>
+              <w:tab w:val="right" w:pos="8639" w:leader="dot"/>
+            </w:tabs>
+            <w:rPr/>
+          </w:pPr>
+          <w:hyperlink w:anchor="__RefHeading___Toc8292_1352511746" w:tooltip="Table 15. Remaining work and completion evidence">
+            <w:r>
+              <w:rPr>
+                <w:rStyle w:val="IndexLink"/>
+              </w:rPr>
+              <w:t>Table 15. Remaining work and completion evidence</w:t>
+              <w:tab/>
+              <w:t>25</w:t>
             </w:r>
           </w:hyperlink>
           <w:r>
@@ -1383,7 +1703,7 @@
         <w:spacing w:before="0" w:after="120"/>
         <w:rPr/>
       </w:pPr>
-      <w:bookmarkStart w:id="2" w:name="__RefHeading___Toc3452_1352511746"/>
+      <w:bookmarkStart w:id="2" w:name="__RefHeading___Toc8190_1352511746"/>
       <w:bookmarkEnd w:id="2"/>
       <w:r>
         <w:rPr/>
@@ -1392,11 +1712,9 @@
     </w:p>
     <w:p>
       <w:pPr>
-        <w:pStyle w:val="GWUTableCaption"/>
-        <w:rPr/>
-      </w:pPr>
-      <w:bookmarkStart w:id="3" w:name="__RefHeading___Toc3530_1352511746"/>
-      <w:bookmarkEnd w:id="3"/>
+        <w:pStyle w:val="Normal"/>
+        <w:rPr/>
+      </w:pPr>
       <w:r>
         <w:rPr/>
         <w:t>Terms used in this manuscript</w:t>
@@ -1960,8 +2278,8 @@
         <w:pStyle w:val="Heading1"/>
         <w:rPr/>
       </w:pPr>
-      <w:bookmarkStart w:id="4" w:name="__RefHeading___Toc3454_1352511746"/>
-      <w:bookmarkEnd w:id="4"/>
+      <w:bookmarkStart w:id="3" w:name="__RefHeading___Toc8192_1352511746"/>
+      <w:bookmarkEnd w:id="3"/>
       <w:r>
         <w:rPr/>
         <w:t>Chapter 1: Introduction</w:t>
@@ -1972,8 +2290,8 @@
         <w:pStyle w:val="Heading2"/>
         <w:rPr/>
       </w:pPr>
-      <w:bookmarkStart w:id="5" w:name="__RefHeading___Toc3456_1352511746"/>
-      <w:bookmarkEnd w:id="5"/>
+      <w:bookmarkStart w:id="4" w:name="__RefHeading___Toc8194_1352511746"/>
+      <w:bookmarkEnd w:id="4"/>
       <w:r>
         <w:rPr/>
         <w:t>1.1 Background and motivation</w:t>
@@ -2004,8 +2322,8 @@
         <w:pStyle w:val="Heading2"/>
         <w:rPr/>
       </w:pPr>
-      <w:bookmarkStart w:id="6" w:name="__RefHeading___Toc3458_1352511746"/>
-      <w:bookmarkEnd w:id="6"/>
+      <w:bookmarkStart w:id="5" w:name="__RefHeading___Toc8196_1352511746"/>
+      <w:bookmarkEnd w:id="5"/>
       <w:r>
         <w:rPr/>
         <w:t>1.2 Problem statement</w:t>
@@ -2026,8 +2344,8 @@
         <w:pStyle w:val="Heading2"/>
         <w:rPr/>
       </w:pPr>
-      <w:bookmarkStart w:id="7" w:name="__RefHeading___Toc3460_1352511746"/>
-      <w:bookmarkEnd w:id="7"/>
+      <w:bookmarkStart w:id="6" w:name="__RefHeading___Toc8198_1352511746"/>
+      <w:bookmarkEnd w:id="6"/>
       <w:r>
         <w:rPr/>
         <w:t>1.3 Purpose and proposed thesis</w:t>
@@ -2048,8 +2366,8 @@
         <w:pStyle w:val="Heading2"/>
         <w:rPr/>
       </w:pPr>
-      <w:bookmarkStart w:id="8" w:name="__RefHeading___Toc3462_1352511746"/>
-      <w:bookmarkEnd w:id="8"/>
+      <w:bookmarkStart w:id="7" w:name="__RefHeading___Toc8200_1352511746"/>
+      <w:bookmarkEnd w:id="7"/>
       <w:r>
         <w:rPr/>
         <w:t>1.4 Practical impact</w:t>
@@ -2070,8 +2388,8 @@
         <w:pStyle w:val="Heading2"/>
         <w:rPr/>
       </w:pPr>
-      <w:bookmarkStart w:id="9" w:name="__RefHeading___Toc3464_1352511746"/>
-      <w:bookmarkEnd w:id="9"/>
+      <w:bookmarkStart w:id="8" w:name="__RefHeading___Toc8202_1352511746"/>
+      <w:bookmarkEnd w:id="8"/>
       <w:r>
         <w:rPr/>
         <w:t>1.5 Research questions and hypotheses</w:t>
@@ -2082,8 +2400,8 @@
         <w:pStyle w:val="GWUTableCaption"/>
         <w:rPr/>
       </w:pPr>
-      <w:bookmarkStart w:id="10" w:name="__RefHeading___Toc3548_1352511746"/>
-      <w:bookmarkEnd w:id="10"/>
+      <w:bookmarkStart w:id="9" w:name="__RefHeading___Toc8290_1352511746"/>
+      <w:bookmarkEnd w:id="9"/>
       <w:r>
         <w:rPr/>
         <w:t>Table 1. Research alignment</w:t>
@@ -2222,7 +2540,7 @@
               <w:rPr>
                 <w:sz w:val="20"/>
               </w:rPr>
-              <w:t>RQ2. Does command order add information beyond command frequency?</w:t>
+              <w:t>RQ2. Does removing argument detail improve transfer compared with the TRACE-style baseline?</w:t>
             </w:r>
           </w:p>
         </w:tc>
@@ -2243,7 +2561,7 @@
               <w:rPr>
                 <w:sz w:val="20"/>
               </w:rPr>
-              <w:t>H2. Ordered verbs improve AI recall by &gt;=5 percentage points over frequency-only verbs at separately calibrated &lt;=5% human-group FPR, and the paired 95% interval for the improvement excludes zero on fresh data.</w:t>
+              <w:t>H2. On fresh matched data, a preselected masked representation improves AI recall by &gt;=5 percentage points over TRACE-style SVC, both satisfy &lt;=5% mean human-group FPR, and the paired 95% improvement interval excludes zero. If either violates the error limit, H2 is not supported.</w:t>
             </w:r>
           </w:p>
         </w:tc>
@@ -2303,7 +2621,7 @@
       </w:pPr>
       <w:r>
         <w:rPr/>
-        <w:t>These are proposed confirmatory hypotheses for the fresh matched study. PX-118 provides development diagnostics only. Its broad removal of all arguments is not the harmless renaming intervention required by H3. Failure of H2 would mean frequencies are sufficient in the tested setting; it would not invalidate H1. Exact score reconstruction is a correctness requirement and is not itself a novel research result.</w:t>
+        <w:t>These are proposed confirmatory hypotheses for the fresh matched study. PX-118 provides development diagnostics only. Its broad removal of all arguments is not the harmless renaming intervention required by H3. Failure to support H2 does not establish equivalence or invalidate H1. Command-order comparisons remain secondary development analyses. This revised prospective RQ2 does not change the historical PX-118 protocol. Exact score reconstruction is a correctness requirement and is not itself a novel research result.</w:t>
       </w:r>
     </w:p>
     <w:p>
@@ -2311,8 +2629,8 @@
         <w:pStyle w:val="Heading2"/>
         <w:rPr/>
       </w:pPr>
-      <w:bookmarkStart w:id="11" w:name="__RefHeading___Toc3466_1352511746"/>
-      <w:bookmarkEnd w:id="11"/>
+      <w:bookmarkStart w:id="10" w:name="__RefHeading___Toc8204_1352511746"/>
+      <w:bookmarkEnd w:id="10"/>
       <w:r>
         <w:rPr/>
         <w:t>1.6 Scope and limitations</w:t>
@@ -2336,6 +2654,28 @@
       <w:r>
         <w:rPr/>
         <w:t>Human and AI labels align with GAMBiT and Honey respectively. Common preprocessing does not make their tasks equivalent. Related windows are not independent people. The small Rouxii subset cannot establish population-wide transfer.</w:t>
+      </w:r>
+    </w:p>
+    <w:p>
+      <w:pPr>
+        <w:pStyle w:val="Heading2"/>
+        <w:rPr/>
+      </w:pPr>
+      <w:bookmarkStart w:id="11" w:name="__RefHeading___Toc8206_1352511746"/>
+      <w:bookmarkEnd w:id="11"/>
+      <w:r>
+        <w:rPr/>
+        <w:t>1.7 Objectives and organization</w:t>
+      </w:r>
+    </w:p>
+    <w:p>
+      <w:pPr>
+        <w:pStyle w:val="Normal"/>
+        <w:rPr/>
+      </w:pPr>
+      <w:r>
+        <w:rPr/>
+        <w:t>The objectives are to qualify operator labels, measure attribution errors at a fixed operating rule, identify which command details drive those errors, and test the resulting procedure on fresh matched conditions. Chapter 2 establishes the prior work. Chapter 3 defines the data and tests. Chapter 4 reports completed results, including unfavorable outcomes. Chapter 5 states the contribution and what remains unproved.</w:t>
       </w:r>
     </w:p>
     <w:p>
@@ -2356,7 +2696,7 @@
         <w:spacing w:before="0" w:after="120"/>
         <w:rPr/>
       </w:pPr>
-      <w:bookmarkStart w:id="12" w:name="__RefHeading___Toc3468_1352511746"/>
+      <w:bookmarkStart w:id="12" w:name="__RefHeading___Toc8208_1352511746"/>
       <w:bookmarkEnd w:id="12"/>
       <w:r>
         <w:rPr/>
@@ -2368,7 +2708,7 @@
         <w:pStyle w:val="Heading2"/>
         <w:rPr/>
       </w:pPr>
-      <w:bookmarkStart w:id="13" w:name="__RefHeading___Toc3470_1352511746"/>
+      <w:bookmarkStart w:id="13" w:name="__RefHeading___Toc8210_1352511746"/>
       <w:bookmarkEnd w:id="13"/>
       <w:r>
         <w:rPr/>
@@ -2390,7 +2730,7 @@
         <w:pStyle w:val="Heading2"/>
         <w:rPr/>
       </w:pPr>
-      <w:bookmarkStart w:id="14" w:name="__RefHeading___Toc3472_1352511746"/>
+      <w:bookmarkStart w:id="14" w:name="__RefHeading___Toc8212_1352511746"/>
       <w:bookmarkEnd w:id="14"/>
       <w:r>
         <w:rPr/>
@@ -2412,7 +2752,7 @@
         <w:pStyle w:val="Heading2"/>
         <w:rPr/>
       </w:pPr>
-      <w:bookmarkStart w:id="15" w:name="__RefHeading___Toc3474_1352511746"/>
+      <w:bookmarkStart w:id="15" w:name="__RefHeading___Toc8214_1352511746"/>
       <w:bookmarkEnd w:id="15"/>
       <w:r>
         <w:rPr/>
@@ -2444,7 +2784,7 @@
         <w:pStyle w:val="Heading2"/>
         <w:rPr/>
       </w:pPr>
-      <w:bookmarkStart w:id="16" w:name="__RefHeading___Toc3476_1352511746"/>
+      <w:bookmarkStart w:id="16" w:name="__RefHeading___Toc8216_1352511746"/>
       <w:bookmarkEnd w:id="16"/>
       <w:r>
         <w:rPr/>
@@ -2466,7 +2806,7 @@
         <w:pStyle w:val="Heading2"/>
         <w:rPr/>
       </w:pPr>
-      <w:bookmarkStart w:id="17" w:name="__RefHeading___Toc3478_1352511746"/>
+      <w:bookmarkStart w:id="17" w:name="__RefHeading___Toc8218_1352511746"/>
       <w:bookmarkEnd w:id="17"/>
       <w:r>
         <w:rPr/>
@@ -2508,7 +2848,7 @@
         <w:pStyle w:val="GWUTableCaption"/>
         <w:rPr/>
       </w:pPr>
-      <w:bookmarkStart w:id="18" w:name="__RefHeading___Toc3546_1352511746"/>
+      <w:bookmarkStart w:id="18" w:name="__RefHeading___Toc8318_1352511746"/>
       <w:bookmarkEnd w:id="18"/>
       <w:r>
         <w:rPr/>
@@ -2797,7 +3137,7 @@
         <w:spacing w:before="0" w:after="120"/>
         <w:rPr/>
       </w:pPr>
-      <w:bookmarkStart w:id="19" w:name="__RefHeading___Toc3480_1352511746"/>
+      <w:bookmarkStart w:id="19" w:name="__RefHeading___Toc8220_1352511746"/>
       <w:bookmarkEnd w:id="19"/>
       <w:r>
         <w:rPr/>
@@ -2809,7 +3149,7 @@
         <w:pStyle w:val="Heading2"/>
         <w:rPr/>
       </w:pPr>
-      <w:bookmarkStart w:id="20" w:name="__RefHeading___Toc3482_1352511746"/>
+      <w:bookmarkStart w:id="20" w:name="__RefHeading___Toc8222_1352511746"/>
       <w:bookmarkEnd w:id="20"/>
       <w:r>
         <w:rPr/>
@@ -2831,110 +3171,76 @@
         <w:pStyle w:val="GWUFigureCaption"/>
         <w:rPr/>
       </w:pPr>
-      <w:bookmarkStart w:id="21" w:name="__RefHeading___Toc3527_1352511746"/>
+      <w:bookmarkStart w:id="21" w:name="__RefHeading___Toc8283_1352511746"/>
       <w:bookmarkEnd w:id="21"/>
       <w:r>
         <w:rPr/>
-        <w:t>Figure 1. Command-attribution study workflow</w:t>
+        <w:t>Figure 1. Current development data and required matched evaluation</w:t>
       </w:r>
     </w:p>
     <w:p>
       <w:pPr>
         <w:pStyle w:val="Normal"/>
-        <w:spacing w:lineRule="auto" w:line="240" w:before="0" w:after="140"/>
-        <w:ind w:hanging="0"/>
-        <w:jc w:val="center"/>
         <w:rPr/>
       </w:pPr>
       <w:r>
         <w:rPr/>
-        <w:t>1. Known human and autonomous-AI operators</w:t>
+        <w:drawing>
+          <wp:inline distT="0" distB="0" distL="0" distR="0">
+            <wp:extent cx="5303520" cy="3853815"/>
+            <wp:effectExtent l="0" t="0" r="0" b="0"/>
+            <wp:docPr id="1" name="Picture 1"/>
+            <wp:cNvGraphicFramePr>
+              <a:graphicFrameLocks xmlns:a="http://schemas.openxmlformats.org/drawingml/2006/main" noChangeAspect="1"/>
+            </wp:cNvGraphicFramePr>
+            <a:graphic xmlns:a="http://schemas.openxmlformats.org/drawingml/2006/main">
+              <a:graphicData uri="http://schemas.openxmlformats.org/drawingml/2006/picture">
+                <pic:pic xmlns:pic="http://schemas.openxmlformats.org/drawingml/2006/picture">
+                  <pic:nvPicPr>
+                    <pic:cNvPr id="1" name="Picture 1"/>
+                    <pic:cNvPicPr>
+                      <a:picLocks noChangeAspect="1" noChangeArrowheads="1"/>
+                    </pic:cNvPicPr>
+                  </pic:nvPicPr>
+                  <pic:blipFill>
+                    <a:blip r:embed="rId5"/>
+                    <a:stretch>
+                      <a:fillRect/>
+                    </a:stretch>
+                  </pic:blipFill>
+                  <pic:spPr bwMode="auto">
+                    <a:xfrm>
+                      <a:off x="0" y="0"/>
+                      <a:ext cx="5303520" cy="3853815"/>
+                    </a:xfrm>
+                    <a:prstGeom prst="rect">
+                      <a:avLst/>
+                    </a:prstGeom>
+                    <a:noFill/>
+                  </pic:spPr>
+                </pic:pic>
+              </a:graphicData>
+            </a:graphic>
+          </wp:inline>
+        </w:drawing>
       </w:r>
     </w:p>
     <w:p>
       <w:pPr>
         <w:pStyle w:val="Normal"/>
-        <w:spacing w:lineRule="auto" w:line="240" w:before="0" w:after="140"/>
-        <w:ind w:hanging="0"/>
-        <w:jc w:val="center"/>
         <w:rPr/>
       </w:pPr>
       <w:r>
         <w:rPr/>
-        <w:t>2. Same tasks, starting state and recorder (fresh study)</w:t>
+        <w:t>The left-hand data sources support development. They cannot separate operator effects from source effects. The matched collection on the right is still pending. Both paths use the same evaluation steps. All figures were prepared for this study.</w:t>
       </w:r>
     </w:p>
     <w:p>
       <w:pPr>
-        <w:pStyle w:val="Normal"/>
-        <w:spacing w:lineRule="auto" w:line="240" w:before="0" w:after="140"/>
-        <w:ind w:hanging="0"/>
-        <w:jc w:val="center"/>
-        <w:rPr/>
-      </w:pPr>
-      <w:r>
-        <w:rPr/>
-        <w:t>3. Recorded commands -&gt; common normalization</w:t>
-      </w:r>
-    </w:p>
-    <w:p>
-      <w:pPr>
-        <w:pStyle w:val="Normal"/>
-        <w:spacing w:lineRule="auto" w:line="240" w:before="0" w:after="140"/>
-        <w:ind w:hanging="0"/>
-        <w:jc w:val="center"/>
-        <w:rPr/>
-      </w:pPr>
-      <w:r>
-        <w:rPr/>
-        <w:t>4. Separate training / calibration / untouched evaluation</w:t>
-      </w:r>
-    </w:p>
-    <w:p>
-      <w:pPr>
-        <w:pStyle w:val="Normal"/>
-        <w:spacing w:lineRule="auto" w:line="240" w:before="0" w:after="140"/>
-        <w:ind w:hanging="0"/>
-        <w:jc w:val="center"/>
-        <w:rPr/>
-      </w:pPr>
-      <w:r>
-        <w:rPr/>
-        <w:t>5. Compare frequency, ordered verbs and TRACE-style models</w:t>
-      </w:r>
-    </w:p>
-    <w:p>
-      <w:pPr>
-        <w:pStyle w:val="Normal"/>
-        <w:spacing w:lineRule="auto" w:line="240" w:before="0" w:after="140"/>
-        <w:ind w:hanging="0"/>
-        <w:jc w:val="center"/>
-        <w:rPr/>
-      </w:pPr>
-      <w:r>
-        <w:rPr/>
-        <w:t>6. Fixed threshold -&gt; operator label + feature contributions</w:t>
-      </w:r>
-    </w:p>
-    <w:p>
-      <w:pPr>
-        <w:pStyle w:val="Normal"/>
-        <w:spacing w:lineRule="auto" w:line="240" w:before="0" w:after="140"/>
-        <w:ind w:hanging="0"/>
-        <w:jc w:val="center"/>
-        <w:rPr/>
-      </w:pPr>
-      <w:r>
-        <w:rPr/>
-        <w:t>7. Measure AI recall, human errors and transfer limits</w:t>
-      </w:r>
-    </w:p>
-    <w:p>
-      <w:pPr>
         <w:pStyle w:val="Heading2"/>
         <w:rPr/>
       </w:pPr>
-      <w:bookmarkStart w:id="22" w:name="__RefHeading___Toc3484_1352511746"/>
+      <w:bookmarkStart w:id="22" w:name="__RefHeading___Toc8224_1352511746"/>
       <w:bookmarkEnd w:id="22"/>
       <w:r>
         <w:rPr/>
@@ -2966,8 +3272,1120 @@
         <w:pStyle w:val="Heading2"/>
         <w:rPr/>
       </w:pPr>
-      <w:bookmarkStart w:id="23" w:name="__RefHeading___Toc3486_1352511746"/>
+      <w:bookmarkStart w:id="23" w:name="__RefHeading___Toc8226_1352511746"/>
       <w:bookmarkEnd w:id="23"/>
+      <w:r>
+        <w:rPr/>
+        <w:t>3.2.1 Dataset evaluation</w:t>
+      </w:r>
+    </w:p>
+    <w:p>
+      <w:pPr>
+        <w:pStyle w:val="GWUTableCaption"/>
+        <w:rPr/>
+      </w:pPr>
+      <w:bookmarkStart w:id="24" w:name="__RefHeading___Toc8316_1352511746"/>
+      <w:bookmarkEnd w:id="24"/>
+      <w:r>
+        <w:rPr/>
+        <w:t>Table 3. What each dataset can support</w:t>
+      </w:r>
+    </w:p>
+    <w:tbl>
+      <w:tblPr>
+        <w:tblW w:w="8640" w:type="dxa"/>
+        <w:jc w:val="start"/>
+        <w:tblInd w:w="108" w:type="dxa"/>
+        <w:tblLayout w:type="fixed"/>
+        <w:tblCellMar>
+          <w:top w:w="0" w:type="dxa"/>
+          <w:start w:w="108" w:type="dxa"/>
+          <w:bottom w:w="0" w:type="dxa"/>
+          <w:end w:w="108" w:type="dxa"/>
+        </w:tblCellMar>
+        <w:tblLook w:val="04a0" w:firstRow="1" w:noVBand="1" w:lastRow="0" w:firstColumn="1" w:lastColumn="0" w:noHBand="0"/>
+      </w:tblPr>
+      <w:tblGrid>
+        <w:gridCol w:w="2880"/>
+        <w:gridCol w:w="2880"/>
+        <w:gridCol w:w="2880"/>
+      </w:tblGrid>
+      <w:tr>
+        <w:trPr>
+          <w:tblHeader w:val="true"/>
+        </w:trPr>
+        <w:tc>
+          <w:tcPr>
+            <w:tcW w:w="2880" w:type="dxa"/>
+            <w:tcBorders/>
+          </w:tcPr>
+          <w:p>
+            <w:pPr>
+              <w:pStyle w:val="Normal"/>
+              <w:keepNext w:val="true"/>
+              <w:spacing w:lineRule="auto" w:line="240" w:before="0" w:after="120"/>
+              <w:ind w:hanging="0"/>
+              <w:rPr/>
+            </w:pPr>
+            <w:r>
+              <w:rPr>
+                <w:sz w:val="20"/>
+              </w:rPr>
+              <w:t>Source</w:t>
+            </w:r>
+          </w:p>
+        </w:tc>
+        <w:tc>
+          <w:tcPr>
+            <w:tcW w:w="2880" w:type="dxa"/>
+            <w:tcBorders/>
+          </w:tcPr>
+          <w:p>
+            <w:pPr>
+              <w:pStyle w:val="Normal"/>
+              <w:keepNext w:val="true"/>
+              <w:spacing w:lineRule="auto" w:line="240" w:before="0" w:after="120"/>
+              <w:ind w:hanging="0"/>
+              <w:rPr/>
+            </w:pPr>
+            <w:r>
+              <w:rPr>
+                <w:sz w:val="20"/>
+              </w:rPr>
+              <w:t>Qualified material</w:t>
+            </w:r>
+          </w:p>
+        </w:tc>
+        <w:tc>
+          <w:tcPr>
+            <w:tcW w:w="2880" w:type="dxa"/>
+            <w:tcBorders/>
+          </w:tcPr>
+          <w:p>
+            <w:pPr>
+              <w:pStyle w:val="Normal"/>
+              <w:keepNext w:val="true"/>
+              <w:spacing w:lineRule="auto" w:line="240" w:before="0" w:after="120"/>
+              <w:ind w:hanging="0"/>
+              <w:rPr/>
+            </w:pPr>
+            <w:r>
+              <w:rPr>
+                <w:sz w:val="20"/>
+              </w:rPr>
+              <w:t>Important limitation</w:t>
+            </w:r>
+          </w:p>
+        </w:tc>
+      </w:tr>
+      <w:tr>
+        <w:trPr>
+          <w:cantSplit/>
+        </w:trPr>
+        <w:tc>
+          <w:tcPr>
+            <w:tcW w:w="2880" w:type="dxa"/>
+            <w:tcBorders/>
+          </w:tcPr>
+          <w:p>
+            <w:pPr>
+              <w:pStyle w:val="Normal"/>
+              <w:keepNext w:val="true"/>
+              <w:spacing w:lineRule="auto" w:line="240" w:before="0" w:after="120"/>
+              <w:ind w:hanging="0"/>
+              <w:rPr/>
+            </w:pPr>
+            <w:r>
+              <w:rPr>
+                <w:sz w:val="20"/>
+              </w:rPr>
+              <w:t>GAMBiT (human)</w:t>
+            </w:r>
+          </w:p>
+        </w:tc>
+        <w:tc>
+          <w:tcPr>
+            <w:tcW w:w="2880" w:type="dxa"/>
+            <w:tcBorders/>
+          </w:tcPr>
+          <w:p>
+            <w:pPr>
+              <w:pStyle w:val="Normal"/>
+              <w:keepNext w:val="true"/>
+              <w:spacing w:lineRule="auto" w:line="240" w:before="0" w:after="120"/>
+              <w:ind w:hanging="0"/>
+              <w:rPr/>
+            </w:pPr>
+            <w:r>
+              <w:rPr>
+                <w:sz w:val="20"/>
+              </w:rPr>
+              <w:t>244 windows; 42 conservative groups</w:t>
+            </w:r>
+          </w:p>
+        </w:tc>
+        <w:tc>
+          <w:tcPr>
+            <w:tcW w:w="2880" w:type="dxa"/>
+            <w:tcBorders/>
+          </w:tcPr>
+          <w:p>
+            <w:pPr>
+              <w:pStyle w:val="Normal"/>
+              <w:keepNext w:val="true"/>
+              <w:spacing w:lineRule="auto" w:line="240" w:before="0" w:after="120"/>
+              <w:ind w:hanging="0"/>
+              <w:rPr/>
+            </w:pPr>
+            <w:r>
+              <w:rPr>
+                <w:sz w:val="20"/>
+              </w:rPr>
+              <w:t>Human red-team provenance; tasks differ from Honey.</w:t>
+            </w:r>
+          </w:p>
+        </w:tc>
+      </w:tr>
+      <w:tr>
+        <w:trPr>
+          <w:cantSplit/>
+        </w:trPr>
+        <w:tc>
+          <w:tcPr>
+            <w:tcW w:w="2880" w:type="dxa"/>
+            <w:tcBorders/>
+          </w:tcPr>
+          <w:p>
+            <w:pPr>
+              <w:pStyle w:val="Normal"/>
+              <w:keepNext w:val="true"/>
+              <w:spacing w:lineRule="auto" w:line="240" w:before="0" w:after="120"/>
+              <w:ind w:hanging="0"/>
+              <w:rPr/>
+            </w:pPr>
+            <w:r>
+              <w:rPr>
+                <w:sz w:val="20"/>
+              </w:rPr>
+              <w:t>Honey (AI)</w:t>
+            </w:r>
+          </w:p>
+        </w:tc>
+        <w:tc>
+          <w:tcPr>
+            <w:tcW w:w="2880" w:type="dxa"/>
+            <w:tcBorders/>
+          </w:tcPr>
+          <w:p>
+            <w:pPr>
+              <w:pStyle w:val="Normal"/>
+              <w:keepNext w:val="true"/>
+              <w:spacing w:lineRule="auto" w:line="240" w:before="0" w:after="120"/>
+              <w:ind w:hanging="0"/>
+              <w:rPr/>
+            </w:pPr>
+            <w:r>
+              <w:rPr>
+                <w:sz w:val="20"/>
+              </w:rPr>
+              <w:t>7,659 eligible sessions</w:t>
+            </w:r>
+          </w:p>
+        </w:tc>
+        <w:tc>
+          <w:tcPr>
+            <w:tcW w:w="2880" w:type="dxa"/>
+            <w:tcBorders/>
+          </w:tcPr>
+          <w:p>
+            <w:pPr>
+              <w:pStyle w:val="Normal"/>
+              <w:keepNext w:val="true"/>
+              <w:spacing w:lineRule="auto" w:line="240" w:before="0" w:after="120"/>
+              <w:ind w:hanging="0"/>
+              <w:rPr/>
+            </w:pPr>
+            <w:r>
+              <w:rPr>
+                <w:sz w:val="20"/>
+              </w:rPr>
+              <w:t>Autonomous SSH activity; not all sessions are multi-stage attacks.</w:t>
+            </w:r>
+          </w:p>
+        </w:tc>
+      </w:tr>
+      <w:tr>
+        <w:trPr>
+          <w:cantSplit/>
+        </w:trPr>
+        <w:tc>
+          <w:tcPr>
+            <w:tcW w:w="2880" w:type="dxa"/>
+            <w:tcBorders/>
+          </w:tcPr>
+          <w:p>
+            <w:pPr>
+              <w:pStyle w:val="Normal"/>
+              <w:keepNext w:val="true"/>
+              <w:spacing w:lineRule="auto" w:line="240" w:before="0" w:after="120"/>
+              <w:ind w:hanging="0"/>
+              <w:rPr/>
+            </w:pPr>
+            <w:r>
+              <w:rPr>
+                <w:sz w:val="20"/>
+              </w:rPr>
+              <w:t>KYPO (human)</w:t>
+            </w:r>
+          </w:p>
+        </w:tc>
+        <w:tc>
+          <w:tcPr>
+            <w:tcW w:w="2880" w:type="dxa"/>
+            <w:tcBorders/>
+          </w:tcPr>
+          <w:p>
+            <w:pPr>
+              <w:pStyle w:val="Normal"/>
+              <w:keepNext w:val="true"/>
+              <w:spacing w:lineRule="auto" w:line="240" w:before="0" w:after="120"/>
+              <w:ind w:hanging="0"/>
+              <w:rPr/>
+            </w:pPr>
+            <w:r>
+              <w:rPr>
+                <w:sz w:val="20"/>
+              </w:rPr>
+              <w:t>180 external windows after duplicate exclusion</w:t>
+            </w:r>
+          </w:p>
+        </w:tc>
+        <w:tc>
+          <w:tcPr>
+            <w:tcW w:w="2880" w:type="dxa"/>
+            <w:tcBorders/>
+          </w:tcPr>
+          <w:p>
+            <w:pPr>
+              <w:pStyle w:val="Normal"/>
+              <w:keepNext w:val="true"/>
+              <w:spacing w:lineRule="auto" w:line="240" w:before="0" w:after="120"/>
+              <w:ind w:hanging="0"/>
+              <w:rPr/>
+            </w:pPr>
+            <w:r>
+              <w:rPr>
+                <w:sz w:val="20"/>
+              </w:rPr>
+              <w:t>Training-task check; groups are not verified independent people.</w:t>
+            </w:r>
+          </w:p>
+        </w:tc>
+      </w:tr>
+      <w:tr>
+        <w:trPr>
+          <w:cantSplit/>
+        </w:trPr>
+        <w:tc>
+          <w:tcPr>
+            <w:tcW w:w="2880" w:type="dxa"/>
+            <w:tcBorders/>
+          </w:tcPr>
+          <w:p>
+            <w:pPr>
+              <w:pStyle w:val="Normal"/>
+              <w:keepNext w:val="false"/>
+              <w:spacing w:lineRule="auto" w:line="240" w:before="0" w:after="120"/>
+              <w:ind w:hanging="0"/>
+              <w:rPr/>
+            </w:pPr>
+            <w:r>
+              <w:rPr>
+                <w:sz w:val="20"/>
+              </w:rPr>
+              <w:t>Rouxii archive (AI)</w:t>
+            </w:r>
+          </w:p>
+        </w:tc>
+        <w:tc>
+          <w:tcPr>
+            <w:tcW w:w="2880" w:type="dxa"/>
+            <w:tcBorders/>
+          </w:tcPr>
+          <w:p>
+            <w:pPr>
+              <w:pStyle w:val="Normal"/>
+              <w:keepNext w:val="false"/>
+              <w:spacing w:lineRule="auto" w:line="240" w:before="0" w:after="120"/>
+              <w:ind w:hanging="0"/>
+              <w:rPr/>
+            </w:pPr>
+            <w:r>
+              <w:rPr>
+                <w:sz w:val="20"/>
+              </w:rPr>
+              <w:t>2 eligible runs from 1,544 reports</w:t>
+            </w:r>
+          </w:p>
+        </w:tc>
+        <w:tc>
+          <w:tcPr>
+            <w:tcW w:w="2880" w:type="dxa"/>
+            <w:tcBorders/>
+          </w:tcPr>
+          <w:p>
+            <w:pPr>
+              <w:pStyle w:val="Normal"/>
+              <w:keepNext w:val="false"/>
+              <w:spacing w:lineRule="auto" w:line="240" w:before="0" w:after="120"/>
+              <w:ind w:hanging="0"/>
+              <w:rPr/>
+            </w:pPr>
+            <w:r>
+              <w:rPr>
+                <w:sz w:val="20"/>
+              </w:rPr>
+              <w:t>Too small for a reliable external AI estimate.</w:t>
+            </w:r>
+          </w:p>
+        </w:tc>
+      </w:tr>
+    </w:tbl>
+    <w:p>
+      <w:pPr>
+        <w:pStyle w:val="Normal"/>
+        <w:rPr/>
+      </w:pPr>
+      <w:r>
+        <w:rPr/>
+        <w:t>These counts have different units and should not be added into a participant total. Eligibility is part of the result: short or structurally incompatible sessions receive no prediction. Honey qualification excluded 2,744 files without the required parsed-command fields and 5,796 with too few eligible commands. Source-level coverage must accompany accuracy; the present classifier does not apply to every session.</w:t>
+      </w:r>
+    </w:p>
+    <w:p>
+      <w:pPr>
+        <w:pStyle w:val="GWUTableCaption"/>
+        <w:rPr/>
+      </w:pPr>
+      <w:bookmarkStart w:id="25" w:name="__RefHeading___Toc8314_1352511746"/>
+      <w:bookmarkEnd w:id="25"/>
+      <w:r>
+        <w:rPr/>
+        <w:t>Table 4. Command representation example (constructed illustration)</w:t>
+      </w:r>
+    </w:p>
+    <w:tbl>
+      <w:tblPr>
+        <w:tblW w:w="8640" w:type="dxa"/>
+        <w:jc w:val="start"/>
+        <w:tblInd w:w="108" w:type="dxa"/>
+        <w:tblLayout w:type="fixed"/>
+        <w:tblCellMar>
+          <w:top w:w="0" w:type="dxa"/>
+          <w:start w:w="108" w:type="dxa"/>
+          <w:bottom w:w="0" w:type="dxa"/>
+          <w:end w:w="108" w:type="dxa"/>
+        </w:tblCellMar>
+        <w:tblLook w:val="04a0" w:firstRow="1" w:noVBand="1" w:lastRow="0" w:firstColumn="1" w:lastColumn="0" w:noHBand="0"/>
+      </w:tblPr>
+      <w:tblGrid>
+        <w:gridCol w:w="2880"/>
+        <w:gridCol w:w="2880"/>
+        <w:gridCol w:w="2880"/>
+      </w:tblGrid>
+      <w:tr>
+        <w:trPr>
+          <w:tblHeader w:val="true"/>
+        </w:trPr>
+        <w:tc>
+          <w:tcPr>
+            <w:tcW w:w="2880" w:type="dxa"/>
+            <w:tcBorders/>
+          </w:tcPr>
+          <w:p>
+            <w:pPr>
+              <w:pStyle w:val="Normal"/>
+              <w:keepNext w:val="true"/>
+              <w:spacing w:lineRule="auto" w:line="240" w:before="0" w:after="120"/>
+              <w:ind w:hanging="0"/>
+              <w:rPr/>
+            </w:pPr>
+            <w:r>
+              <w:rPr>
+                <w:sz w:val="20"/>
+              </w:rPr>
+              <w:t>Input</w:t>
+            </w:r>
+          </w:p>
+        </w:tc>
+        <w:tc>
+          <w:tcPr>
+            <w:tcW w:w="2880" w:type="dxa"/>
+            <w:tcBorders/>
+          </w:tcPr>
+          <w:p>
+            <w:pPr>
+              <w:pStyle w:val="Normal"/>
+              <w:keepNext w:val="true"/>
+              <w:spacing w:lineRule="auto" w:line="240" w:before="0" w:after="120"/>
+              <w:ind w:hanging="0"/>
+              <w:rPr/>
+            </w:pPr>
+            <w:r>
+              <w:rPr>
+                <w:sz w:val="20"/>
+              </w:rPr>
+              <w:t>Representation</w:t>
+            </w:r>
+          </w:p>
+        </w:tc>
+        <w:tc>
+          <w:tcPr>
+            <w:tcW w:w="2880" w:type="dxa"/>
+            <w:tcBorders/>
+          </w:tcPr>
+          <w:p>
+            <w:pPr>
+              <w:pStyle w:val="Normal"/>
+              <w:keepNext w:val="true"/>
+              <w:spacing w:lineRule="auto" w:line="240" w:before="0" w:after="120"/>
+              <w:ind w:hanging="0"/>
+              <w:rPr/>
+            </w:pPr>
+            <w:r>
+              <w:rPr>
+                <w:sz w:val="20"/>
+              </w:rPr>
+              <w:t>Information retained</w:t>
+            </w:r>
+          </w:p>
+        </w:tc>
+      </w:tr>
+      <w:tr>
+        <w:trPr>
+          <w:cantSplit/>
+        </w:trPr>
+        <w:tc>
+          <w:tcPr>
+            <w:tcW w:w="2880" w:type="dxa"/>
+            <w:tcBorders/>
+          </w:tcPr>
+          <w:p>
+            <w:pPr>
+              <w:pStyle w:val="Normal"/>
+              <w:keepNext w:val="true"/>
+              <w:spacing w:lineRule="auto" w:line="240" w:before="0" w:after="120"/>
+              <w:ind w:hanging="0"/>
+              <w:rPr/>
+            </w:pPr>
+            <w:r>
+              <w:rPr>
+                <w:sz w:val="20"/>
+              </w:rPr>
+              <w:t>ls -la /tmp</w:t>
+            </w:r>
+          </w:p>
+        </w:tc>
+        <w:tc>
+          <w:tcPr>
+            <w:tcW w:w="2880" w:type="dxa"/>
+            <w:tcBorders/>
+          </w:tcPr>
+          <w:p>
+            <w:pPr>
+              <w:pStyle w:val="Normal"/>
+              <w:keepNext w:val="true"/>
+              <w:spacing w:lineRule="auto" w:line="240" w:before="0" w:after="120"/>
+              <w:ind w:hanging="0"/>
+              <w:rPr/>
+            </w:pPr>
+            <w:r>
+              <w:rPr>
+                <w:sz w:val="20"/>
+              </w:rPr>
+              <w:t>ls ARG ARG</w:t>
+            </w:r>
+          </w:p>
+        </w:tc>
+        <w:tc>
+          <w:tcPr>
+            <w:tcW w:w="2880" w:type="dxa"/>
+            <w:tcBorders/>
+          </w:tcPr>
+          <w:p>
+            <w:pPr>
+              <w:pStyle w:val="Normal"/>
+              <w:keepNext w:val="true"/>
+              <w:spacing w:lineRule="auto" w:line="240" w:before="0" w:after="120"/>
+              <w:ind w:hanging="0"/>
+              <w:rPr/>
+            </w:pPr>
+            <w:r>
+              <w:rPr>
+                <w:sz w:val="20"/>
+              </w:rPr>
+              <w:t>Verb and two argument positions</w:t>
+            </w:r>
+          </w:p>
+        </w:tc>
+      </w:tr>
+      <w:tr>
+        <w:trPr>
+          <w:cantSplit/>
+        </w:trPr>
+        <w:tc>
+          <w:tcPr>
+            <w:tcW w:w="2880" w:type="dxa"/>
+            <w:tcBorders/>
+          </w:tcPr>
+          <w:p>
+            <w:pPr>
+              <w:pStyle w:val="Normal"/>
+              <w:keepNext w:val="true"/>
+              <w:spacing w:lineRule="auto" w:line="240" w:before="0" w:after="120"/>
+              <w:ind w:hanging="0"/>
+              <w:rPr/>
+            </w:pPr>
+            <w:r>
+              <w:rPr>
+                <w:sz w:val="20"/>
+              </w:rPr>
+              <w:t>ls -la /tmp</w:t>
+            </w:r>
+          </w:p>
+        </w:tc>
+        <w:tc>
+          <w:tcPr>
+            <w:tcW w:w="2880" w:type="dxa"/>
+            <w:tcBorders/>
+          </w:tcPr>
+          <w:p>
+            <w:pPr>
+              <w:pStyle w:val="Normal"/>
+              <w:keepNext w:val="true"/>
+              <w:spacing w:lineRule="auto" w:line="240" w:before="0" w:after="120"/>
+              <w:ind w:hanging="0"/>
+              <w:rPr/>
+            </w:pPr>
+            <w:r>
+              <w:rPr>
+                <w:sz w:val="20"/>
+              </w:rPr>
+              <w:t>ls ARG</w:t>
+            </w:r>
+          </w:p>
+        </w:tc>
+        <w:tc>
+          <w:tcPr>
+            <w:tcW w:w="2880" w:type="dxa"/>
+            <w:tcBorders/>
+          </w:tcPr>
+          <w:p>
+            <w:pPr>
+              <w:pStyle w:val="Normal"/>
+              <w:keepNext w:val="true"/>
+              <w:spacing w:lineRule="auto" w:line="240" w:before="0" w:after="120"/>
+              <w:ind w:hanging="0"/>
+              <w:rPr/>
+            </w:pPr>
+            <w:r>
+              <w:rPr>
+                <w:sz w:val="20"/>
+              </w:rPr>
+              <w:t>One-marker control removes argument count</w:t>
+            </w:r>
+          </w:p>
+        </w:tc>
+      </w:tr>
+      <w:tr>
+        <w:trPr>
+          <w:cantSplit/>
+        </w:trPr>
+        <w:tc>
+          <w:tcPr>
+            <w:tcW w:w="2880" w:type="dxa"/>
+            <w:tcBorders/>
+          </w:tcPr>
+          <w:p>
+            <w:pPr>
+              <w:pStyle w:val="Normal"/>
+              <w:keepNext w:val="true"/>
+              <w:spacing w:lineRule="auto" w:line="240" w:before="0" w:after="120"/>
+              <w:ind w:hanging="0"/>
+              <w:rPr/>
+            </w:pPr>
+            <w:r>
+              <w:rPr>
+                <w:sz w:val="20"/>
+              </w:rPr>
+              <w:t>ls -la /tmp</w:t>
+            </w:r>
+          </w:p>
+        </w:tc>
+        <w:tc>
+          <w:tcPr>
+            <w:tcW w:w="2880" w:type="dxa"/>
+            <w:tcBorders/>
+          </w:tcPr>
+          <w:p>
+            <w:pPr>
+              <w:pStyle w:val="Normal"/>
+              <w:keepNext w:val="true"/>
+              <w:spacing w:lineRule="auto" w:line="240" w:before="0" w:after="120"/>
+              <w:ind w:hanging="0"/>
+              <w:rPr/>
+            </w:pPr>
+            <w:r>
+              <w:rPr>
+                <w:sz w:val="20"/>
+              </w:rPr>
+              <w:t>ls</w:t>
+            </w:r>
+          </w:p>
+        </w:tc>
+        <w:tc>
+          <w:tcPr>
+            <w:tcW w:w="2880" w:type="dxa"/>
+            <w:tcBorders/>
+          </w:tcPr>
+          <w:p>
+            <w:pPr>
+              <w:pStyle w:val="Normal"/>
+              <w:keepNext w:val="true"/>
+              <w:spacing w:lineRule="auto" w:line="240" w:before="0" w:after="120"/>
+              <w:ind w:hanging="0"/>
+              <w:rPr/>
+            </w:pPr>
+            <w:r>
+              <w:rPr>
+                <w:sz w:val="20"/>
+              </w:rPr>
+              <w:t>Verb frequency or sequence</w:t>
+            </w:r>
+          </w:p>
+        </w:tc>
+      </w:tr>
+      <w:tr>
+        <w:trPr>
+          <w:cantSplit/>
+        </w:trPr>
+        <w:tc>
+          <w:tcPr>
+            <w:tcW w:w="2880" w:type="dxa"/>
+            <w:tcBorders/>
+          </w:tcPr>
+          <w:p>
+            <w:pPr>
+              <w:pStyle w:val="Normal"/>
+              <w:keepNext w:val="false"/>
+              <w:spacing w:lineRule="auto" w:line="240" w:before="0" w:after="120"/>
+              <w:ind w:hanging="0"/>
+              <w:rPr/>
+            </w:pPr>
+            <w:r>
+              <w:rPr>
+                <w:sz w:val="20"/>
+              </w:rPr>
+              <w:t>whoami</w:t>
+            </w:r>
+          </w:p>
+        </w:tc>
+        <w:tc>
+          <w:tcPr>
+            <w:tcW w:w="2880" w:type="dxa"/>
+            <w:tcBorders/>
+          </w:tcPr>
+          <w:p>
+            <w:pPr>
+              <w:pStyle w:val="Normal"/>
+              <w:keepNext w:val="false"/>
+              <w:spacing w:lineRule="auto" w:line="240" w:before="0" w:after="120"/>
+              <w:ind w:hanging="0"/>
+              <w:rPr/>
+            </w:pPr>
+            <w:r>
+              <w:rPr>
+                <w:sz w:val="20"/>
+              </w:rPr>
+              <w:t>whoami ARG</w:t>
+            </w:r>
+          </w:p>
+        </w:tc>
+        <w:tc>
+          <w:tcPr>
+            <w:tcW w:w="2880" w:type="dxa"/>
+            <w:tcBorders/>
+          </w:tcPr>
+          <w:p>
+            <w:pPr>
+              <w:pStyle w:val="Normal"/>
+              <w:keepNext w:val="false"/>
+              <w:spacing w:lineRule="auto" w:line="240" w:before="0" w:after="120"/>
+              <w:ind w:hanging="0"/>
+              <w:rPr/>
+            </w:pPr>
+            <w:r>
+              <w:rPr>
+                <w:sz w:val="20"/>
+              </w:rPr>
+              <w:t>One-marker control adds a marker even with zero arguments</w:t>
+            </w:r>
+          </w:p>
+        </w:tc>
+      </w:tr>
+    </w:tbl>
+    <w:p>
+      <w:pPr>
+        <w:pStyle w:val="Normal"/>
+        <w:rPr/>
+      </w:pPr>
+      <w:r>
+        <w:rPr/>
+        <w:t>Table 4 is an illustration, not a collected participant record. The evidence package also includes short normalized excerpts selected by a fixed record-ID rule from actual correct and missed AI examples. No command in these files is executed.</w:t>
+      </w:r>
+    </w:p>
+    <w:p>
+      <w:pPr>
+        <w:pStyle w:val="GWUTableCaption"/>
+        <w:rPr/>
+      </w:pPr>
+      <w:bookmarkStart w:id="26" w:name="__RefHeading___Toc8312_1352511746"/>
+      <w:bookmarkEnd w:id="26"/>
+      <w:r>
+        <w:rPr/>
+        <w:t>Table 5. Actual normalized excerpts from development records</w:t>
+      </w:r>
+    </w:p>
+    <w:tbl>
+      <w:tblPr>
+        <w:tblW w:w="8640" w:type="dxa"/>
+        <w:jc w:val="start"/>
+        <w:tblInd w:w="108" w:type="dxa"/>
+        <w:tblLayout w:type="fixed"/>
+        <w:tblCellMar>
+          <w:top w:w="0" w:type="dxa"/>
+          <w:start w:w="108" w:type="dxa"/>
+          <w:bottom w:w="0" w:type="dxa"/>
+          <w:end w:w="108" w:type="dxa"/>
+        </w:tblCellMar>
+        <w:tblLook w:val="04a0" w:firstRow="1" w:noVBand="1" w:lastRow="0" w:firstColumn="1" w:lastColumn="0" w:noHBand="0"/>
+      </w:tblPr>
+      <w:tblGrid>
+        <w:gridCol w:w="2880"/>
+        <w:gridCol w:w="2880"/>
+        <w:gridCol w:w="2880"/>
+      </w:tblGrid>
+      <w:tr>
+        <w:trPr>
+          <w:tblHeader w:val="true"/>
+        </w:trPr>
+        <w:tc>
+          <w:tcPr>
+            <w:tcW w:w="2880" w:type="dxa"/>
+            <w:tcBorders/>
+          </w:tcPr>
+          <w:p>
+            <w:pPr>
+              <w:pStyle w:val="Normal"/>
+              <w:keepNext w:val="true"/>
+              <w:spacing w:lineRule="auto" w:line="240" w:before="0" w:after="120"/>
+              <w:ind w:hanging="0"/>
+              <w:rPr/>
+            </w:pPr>
+            <w:r>
+              <w:rPr>
+                <w:sz w:val="20"/>
+              </w:rPr>
+              <w:t>Source / outcome</w:t>
+            </w:r>
+          </w:p>
+        </w:tc>
+        <w:tc>
+          <w:tcPr>
+            <w:tcW w:w="2880" w:type="dxa"/>
+            <w:tcBorders/>
+          </w:tcPr>
+          <w:p>
+            <w:pPr>
+              <w:pStyle w:val="Normal"/>
+              <w:keepNext w:val="true"/>
+              <w:spacing w:lineRule="auto" w:line="240" w:before="0" w:after="120"/>
+              <w:ind w:hanging="0"/>
+              <w:rPr/>
+            </w:pPr>
+            <w:r>
+              <w:rPr>
+                <w:sz w:val="20"/>
+              </w:rPr>
+              <w:t>First three commands</w:t>
+            </w:r>
+          </w:p>
+        </w:tc>
+        <w:tc>
+          <w:tcPr>
+            <w:tcW w:w="2880" w:type="dxa"/>
+            <w:tcBorders/>
+          </w:tcPr>
+          <w:p>
+            <w:pPr>
+              <w:pStyle w:val="Normal"/>
+              <w:keepNext w:val="true"/>
+              <w:spacing w:lineRule="auto" w:line="240" w:before="0" w:after="120"/>
+              <w:ind w:hanging="0"/>
+              <w:rPr/>
+            </w:pPr>
+            <w:r>
+              <w:rPr>
+                <w:sz w:val="20"/>
+              </w:rPr>
+              <w:t>AI score</w:t>
+            </w:r>
+          </w:p>
+        </w:tc>
+      </w:tr>
+      <w:tr>
+        <w:trPr>
+          <w:cantSplit/>
+        </w:trPr>
+        <w:tc>
+          <w:tcPr>
+            <w:tcW w:w="2880" w:type="dxa"/>
+            <w:tcBorders/>
+          </w:tcPr>
+          <w:p>
+            <w:pPr>
+              <w:pStyle w:val="Normal"/>
+              <w:keepNext w:val="true"/>
+              <w:spacing w:lineRule="auto" w:line="240" w:before="0" w:after="120"/>
+              <w:ind w:hanging="0"/>
+              <w:rPr/>
+            </w:pPr>
+            <w:r>
+              <w:rPr>
+                <w:sz w:val="20"/>
+              </w:rPr>
+              <w:t>Honey / AI correctly identified</w:t>
+            </w:r>
+          </w:p>
+        </w:tc>
+        <w:tc>
+          <w:tcPr>
+            <w:tcW w:w="2880" w:type="dxa"/>
+            <w:tcBorders/>
+          </w:tcPr>
+          <w:p>
+            <w:pPr>
+              <w:pStyle w:val="Normal"/>
+              <w:keepNext w:val="true"/>
+              <w:spacing w:lineRule="auto" w:line="240" w:before="0" w:after="120"/>
+              <w:ind w:hanging="0"/>
+              <w:rPr/>
+            </w:pPr>
+            <w:r>
+              <w:rPr>
+                <w:sz w:val="20"/>
+              </w:rPr>
+              <w:t>id; whoami; pwd</w:t>
+            </w:r>
+          </w:p>
+        </w:tc>
+        <w:tc>
+          <w:tcPr>
+            <w:tcW w:w="2880" w:type="dxa"/>
+            <w:tcBorders/>
+          </w:tcPr>
+          <w:p>
+            <w:pPr>
+              <w:pStyle w:val="Normal"/>
+              <w:keepNext w:val="true"/>
+              <w:spacing w:lineRule="auto" w:line="240" w:before="0" w:after="120"/>
+              <w:ind w:hanging="0"/>
+              <w:rPr/>
+            </w:pPr>
+            <w:r>
+              <w:rPr>
+                <w:sz w:val="20"/>
+              </w:rPr>
+              <w:t>0.725</w:t>
+            </w:r>
+          </w:p>
+        </w:tc>
+      </w:tr>
+      <w:tr>
+        <w:trPr>
+          <w:cantSplit/>
+        </w:trPr>
+        <w:tc>
+          <w:tcPr>
+            <w:tcW w:w="2880" w:type="dxa"/>
+            <w:tcBorders/>
+          </w:tcPr>
+          <w:p>
+            <w:pPr>
+              <w:pStyle w:val="Normal"/>
+              <w:keepNext w:val="true"/>
+              <w:spacing w:lineRule="auto" w:line="240" w:before="0" w:after="120"/>
+              <w:ind w:hanging="0"/>
+              <w:rPr/>
+            </w:pPr>
+            <w:r>
+              <w:rPr>
+                <w:sz w:val="20"/>
+              </w:rPr>
+              <w:t>Honey / AI missed</w:t>
+            </w:r>
+          </w:p>
+        </w:tc>
+        <w:tc>
+          <w:tcPr>
+            <w:tcW w:w="2880" w:type="dxa"/>
+            <w:tcBorders/>
+          </w:tcPr>
+          <w:p>
+            <w:pPr>
+              <w:pStyle w:val="Normal"/>
+              <w:keepNext w:val="true"/>
+              <w:spacing w:lineRule="auto" w:line="240" w:before="0" w:after="120"/>
+              <w:ind w:hanging="0"/>
+              <w:rPr/>
+            </w:pPr>
+            <w:r>
+              <w:rPr>
+                <w:sz w:val="20"/>
+              </w:rPr>
+              <w:t>ls -a; ls -R; cat README.md</w:t>
+            </w:r>
+          </w:p>
+        </w:tc>
+        <w:tc>
+          <w:tcPr>
+            <w:tcW w:w="2880" w:type="dxa"/>
+            <w:tcBorders/>
+          </w:tcPr>
+          <w:p>
+            <w:pPr>
+              <w:pStyle w:val="Normal"/>
+              <w:keepNext w:val="true"/>
+              <w:spacing w:lineRule="auto" w:line="240" w:before="0" w:after="120"/>
+              <w:ind w:hanging="0"/>
+              <w:rPr/>
+            </w:pPr>
+            <w:r>
+              <w:rPr>
+                <w:sz w:val="20"/>
+              </w:rPr>
+              <w:t>0.430</w:t>
+            </w:r>
+          </w:p>
+        </w:tc>
+      </w:tr>
+      <w:tr>
+        <w:trPr>
+          <w:cantSplit/>
+        </w:trPr>
+        <w:tc>
+          <w:tcPr>
+            <w:tcW w:w="2880" w:type="dxa"/>
+            <w:tcBorders/>
+          </w:tcPr>
+          <w:p>
+            <w:pPr>
+              <w:pStyle w:val="Normal"/>
+              <w:keepNext w:val="false"/>
+              <w:spacing w:lineRule="auto" w:line="240" w:before="0" w:after="120"/>
+              <w:ind w:hanging="0"/>
+              <w:rPr/>
+            </w:pPr>
+            <w:r>
+              <w:rPr>
+                <w:sz w:val="20"/>
+              </w:rPr>
+              <w:t>GAMBiT / Human correctly identified</w:t>
+            </w:r>
+          </w:p>
+        </w:tc>
+        <w:tc>
+          <w:tcPr>
+            <w:tcW w:w="2880" w:type="dxa"/>
+            <w:tcBorders/>
+          </w:tcPr>
+          <w:p>
+            <w:pPr>
+              <w:pStyle w:val="Normal"/>
+              <w:keepNext w:val="false"/>
+              <w:spacing w:lineRule="auto" w:line="240" w:before="0" w:after="120"/>
+              <w:ind w:hanging="0"/>
+              <w:rPr/>
+            </w:pPr>
+            <w:r>
+              <w:rPr>
+                <w:sz w:val="20"/>
+              </w:rPr>
+              <w:t>ls Admin Turnover; ls; ls</w:t>
+            </w:r>
+          </w:p>
+        </w:tc>
+        <w:tc>
+          <w:tcPr>
+            <w:tcW w:w="2880" w:type="dxa"/>
+            <w:tcBorders/>
+          </w:tcPr>
+          <w:p>
+            <w:pPr>
+              <w:pStyle w:val="Normal"/>
+              <w:keepNext w:val="false"/>
+              <w:spacing w:lineRule="auto" w:line="240" w:before="0" w:after="120"/>
+              <w:ind w:hanging="0"/>
+              <w:rPr/>
+            </w:pPr>
+            <w:r>
+              <w:rPr>
+                <w:sz w:val="20"/>
+              </w:rPr>
+              <w:t>0.078</w:t>
+            </w:r>
+          </w:p>
+        </w:tc>
+      </w:tr>
+    </w:tbl>
+    <w:p>
+      <w:pPr>
+        <w:pStyle w:val="Normal"/>
+        <w:rPr/>
+      </w:pPr>
+      <w:r>
+        <w:rPr/>
+        <w:t>Each excerpt is the first three commands from a ten-command window, selected as the lowest record ID in its outcome category. The model scores the full window. The frozen masked threshold is 0.717. Scores are model outputs and have not been validated as calibrated deployment probabilities. In the missed AI example, grep-related contributions lower the AI score; in the human example, repeated ls strongly lowers it. These explain the fitted decision, not the operator's intent.</w:t>
+      </w:r>
+    </w:p>
+    <w:p>
+      <w:pPr>
+        <w:pStyle w:val="Heading2"/>
+        <w:rPr/>
+      </w:pPr>
+      <w:bookmarkStart w:id="27" w:name="__RefHeading___Toc8228_1352511746"/>
+      <w:bookmarkEnd w:id="27"/>
+      <w:r>
+        <w:rPr/>
+        <w:t>3.2.2 Observation point and practical meaning</w:t>
+      </w:r>
+    </w:p>
+    <w:p>
+      <w:pPr>
+        <w:pStyle w:val="Normal"/>
+        <w:rPr/>
+      </w:pPr>
+      <w:r>
+        <w:rPr/>
+        <w:t>The present inputs are recorded operator-side shell commands. A defender could potentially obtain comparable commands from an instrumented shell, session recorder or endpoint process telemetry, but this mapping has not been tested. The study does not infer commands from NetFlow or encrypted packets. The model identifies an operator class within eligible records; it is not an attack detector. No timing feature or attack-stage label is needed for these tests.</w:t>
+      </w:r>
+    </w:p>
+    <w:p>
+      <w:pPr>
+        <w:pStyle w:val="Heading2"/>
+        <w:rPr/>
+      </w:pPr>
+      <w:bookmarkStart w:id="28" w:name="__RefHeading___Toc8230_1352511746"/>
+      <w:bookmarkEnd w:id="28"/>
       <w:r>
         <w:rPr/>
         <w:t>3.3 Models and controlled comparisons</w:t>
@@ -2978,11 +4396,11 @@
         <w:pStyle w:val="GWUTableCaption"/>
         <w:rPr/>
       </w:pPr>
-      <w:bookmarkStart w:id="24" w:name="__RefHeading___Toc3544_1352511746"/>
-      <w:bookmarkEnd w:id="24"/>
+      <w:bookmarkStart w:id="29" w:name="__RefHeading___Toc8310_1352511746"/>
+      <w:bookmarkEnd w:id="29"/>
       <w:r>
         <w:rPr/>
-        <w:t>Table 3. PX-118 model comparisons</w:t>
+        <w:t>Table 6. PX-118 model comparisons</w:t>
       </w:r>
     </w:p>
     <w:tbl>
@@ -3358,8 +4776,8 @@
         <w:pStyle w:val="Heading2"/>
         <w:rPr/>
       </w:pPr>
-      <w:bookmarkStart w:id="25" w:name="__RefHeading___Toc3488_1352511746"/>
-      <w:bookmarkEnd w:id="25"/>
+      <w:bookmarkStart w:id="30" w:name="__RefHeading___Toc8232_1352511746"/>
+      <w:bookmarkEnd w:id="30"/>
       <w:r>
         <w:rPr/>
         <w:t>3.4 Thresholds, metrics and uncertainty</w:t>
@@ -3400,8 +4818,8 @@
         <w:pStyle w:val="Heading2"/>
         <w:rPr/>
       </w:pPr>
-      <w:bookmarkStart w:id="26" w:name="__RefHeading___Toc3490_1352511746"/>
-      <w:bookmarkEnd w:id="26"/>
+      <w:bookmarkStart w:id="31" w:name="__RefHeading___Toc8234_1352511746"/>
+      <w:bookmarkEnd w:id="31"/>
       <w:r>
         <w:rPr/>
         <w:t>3.5 Explanation and perturbation tests</w:t>
@@ -3432,8 +4850,8 @@
         <w:pStyle w:val="Heading2"/>
         <w:rPr/>
       </w:pPr>
-      <w:bookmarkStart w:id="27" w:name="__RefHeading___Toc3492_1352511746"/>
-      <w:bookmarkEnd w:id="27"/>
+      <w:bookmarkStart w:id="32" w:name="__RefHeading___Toc8236_1352511746"/>
+      <w:bookmarkEnd w:id="32"/>
       <w:r>
         <w:rPr/>
         <w:t>3.6 Independent-source probe</w:t>
@@ -3454,8 +4872,8 @@
         <w:pStyle w:val="Heading2"/>
         <w:rPr/>
       </w:pPr>
-      <w:bookmarkStart w:id="28" w:name="__RefHeading___Toc3494_1352511746"/>
-      <w:bookmarkEnd w:id="28"/>
+      <w:bookmarkStart w:id="33" w:name="__RefHeading___Toc8238_1352511746"/>
+      <w:bookmarkEnd w:id="33"/>
       <w:r>
         <w:rPr/>
         <w:t>3.7 Matched collection and feasibility</w:t>
@@ -3496,8 +4914,8 @@
         <w:pStyle w:val="Heading2"/>
         <w:rPr/>
       </w:pPr>
-      <w:bookmarkStart w:id="29" w:name="__RefHeading___Toc3496_1352511746"/>
-      <w:bookmarkEnd w:id="29"/>
+      <w:bookmarkStart w:id="34" w:name="__RefHeading___Toc8240_1352511746"/>
+      <w:bookmarkEnd w:id="34"/>
       <w:r>
         <w:rPr/>
         <w:t>3.8 Reproducibility and stopping rules</w:t>
@@ -3521,6 +4939,99 @@
       <w:r>
         <w:rPr/>
         <w:t>The study stops short of a transfer claim if labels or command records cannot be independently qualified, if no adequate external sample exists, or if the fresh matched operating targets fail. A negative result is retained. Changing the command minimum or threshold after seeing an external result requires a new development protocol and new evaluation data.</w:t>
+      </w:r>
+    </w:p>
+    <w:p>
+      <w:pPr>
+        <w:pStyle w:val="Heading2"/>
+        <w:rPr/>
+      </w:pPr>
+      <w:bookmarkStart w:id="35" w:name="__RefHeading___Toc8242_1352511746"/>
+      <w:bookmarkEnd w:id="35"/>
+      <w:r>
+        <w:rPr/>
+        <w:t>3.9 Graphical methodology representation (GMR)</w:t>
+      </w:r>
+    </w:p>
+    <w:p>
+      <w:pPr>
+        <w:pStyle w:val="GWUFigureCaption"/>
+        <w:rPr/>
+      </w:pPr>
+      <w:bookmarkStart w:id="36" w:name="__RefHeading___Toc8287_1352511746"/>
+      <w:bookmarkEnd w:id="36"/>
+      <w:r>
+        <w:rPr/>
+        <w:t>Figure 2. GMR: what is tested, why it matters and how it is evaluated</w:t>
+      </w:r>
+    </w:p>
+    <w:p>
+      <w:pPr>
+        <w:pStyle w:val="Normal"/>
+        <w:rPr/>
+      </w:pPr>
+      <w:r>
+        <w:rPr/>
+        <w:drawing>
+          <wp:inline distT="0" distB="0" distL="0" distR="0">
+            <wp:extent cx="4572000" cy="4662805"/>
+            <wp:effectExtent l="0" t="0" r="0" b="0"/>
+            <wp:docPr id="2" name="Picture 2"/>
+            <wp:cNvGraphicFramePr>
+              <a:graphicFrameLocks xmlns:a="http://schemas.openxmlformats.org/drawingml/2006/main" noChangeAspect="1"/>
+            </wp:cNvGraphicFramePr>
+            <a:graphic xmlns:a="http://schemas.openxmlformats.org/drawingml/2006/main">
+              <a:graphicData uri="http://schemas.openxmlformats.org/drawingml/2006/picture">
+                <pic:pic xmlns:pic="http://schemas.openxmlformats.org/drawingml/2006/picture">
+                  <pic:nvPicPr>
+                    <pic:cNvPr id="2" name="Picture 2"/>
+                    <pic:cNvPicPr>
+                      <a:picLocks noChangeAspect="1" noChangeArrowheads="1"/>
+                    </pic:cNvPicPr>
+                  </pic:nvPicPr>
+                  <pic:blipFill>
+                    <a:blip r:embed="rId6"/>
+                    <a:stretch>
+                      <a:fillRect/>
+                    </a:stretch>
+                  </pic:blipFill>
+                  <pic:spPr bwMode="auto">
+                    <a:xfrm>
+                      <a:off x="0" y="0"/>
+                      <a:ext cx="4572000" cy="4662805"/>
+                    </a:xfrm>
+                    <a:prstGeom prst="rect">
+                      <a:avLst/>
+                    </a:prstGeom>
+                    <a:noFill/>
+                  </pic:spPr>
+                </pic:pic>
+              </a:graphicData>
+            </a:graphic>
+          </wp:inline>
+        </w:drawing>
+      </w:r>
+    </w:p>
+    <w:p>
+      <w:pPr>
+        <w:pStyle w:val="Heading2"/>
+        <w:rPr/>
+      </w:pPr>
+      <w:bookmarkStart w:id="37" w:name="__RefHeading___Toc8244_1352511746"/>
+      <w:bookmarkEnd w:id="37"/>
+      <w:r>
+        <w:rPr/>
+        <w:t>3.10 Additional development test: PX-119</w:t>
+      </w:r>
+    </w:p>
+    <w:p>
+      <w:pPr>
+        <w:pStyle w:val="Normal"/>
+        <w:rPr/>
+      </w:pPr>
+      <w:r>
+        <w:rPr/>
+        <w:t>PX-119 was specified before fitting at commit e1f40ed. It reuses examined partitions, weights and calibration rules. Three controls compare positional counts, count summaries and one ARG token per verb. A separate stress test equalizes counts in the frozen masked model. Meaning preservation is not assumed. The three local fits took less than one second.</w:t>
       </w:r>
     </w:p>
     <w:p>
@@ -3541,8 +5052,8 @@
         <w:spacing w:before="0" w:after="120"/>
         <w:rPr/>
       </w:pPr>
-      <w:bookmarkStart w:id="30" w:name="__RefHeading___Toc3498_1352511746"/>
-      <w:bookmarkEnd w:id="30"/>
+      <w:bookmarkStart w:id="38" w:name="__RefHeading___Toc8246_1352511746"/>
+      <w:bookmarkEnd w:id="38"/>
       <w:r>
         <w:rPr/>
         <w:t>Chapter 4: Completed Development Results</w:t>
@@ -3553,8 +5064,8 @@
         <w:pStyle w:val="Heading2"/>
         <w:rPr/>
       </w:pPr>
-      <w:bookmarkStart w:id="31" w:name="__RefHeading___Toc3500_1352511746"/>
-      <w:bookmarkEnd w:id="31"/>
+      <w:bookmarkStart w:id="39" w:name="__RefHeading___Toc8248_1352511746"/>
+      <w:bookmarkEnd w:id="39"/>
       <w:r>
         <w:rPr/>
         <w:t>4.1 Preliminary PX-117C evidence</w:t>
@@ -3565,11 +5076,11 @@
         <w:pStyle w:val="GWUTableCaption"/>
         <w:rPr/>
       </w:pPr>
-      <w:bookmarkStart w:id="32" w:name="__RefHeading___Toc3542_1352511746"/>
-      <w:bookmarkEnd w:id="32"/>
+      <w:bookmarkStart w:id="40" w:name="__RefHeading___Toc8308_1352511746"/>
+      <w:bookmarkEnd w:id="40"/>
       <w:r>
         <w:rPr/>
-        <w:t>Table 4. PX-117C main operating points</w:t>
+        <w:t>Table 7. PX-117C main operating points</w:t>
       </w:r>
     </w:p>
     <w:tbl>
@@ -3964,8 +5475,8 @@
         <w:pStyle w:val="Heading2"/>
         <w:rPr/>
       </w:pPr>
-      <w:bookmarkStart w:id="33" w:name="__RefHeading___Toc3502_1352511746"/>
-      <w:bookmarkEnd w:id="33"/>
+      <w:bookmarkStart w:id="41" w:name="__RefHeading___Toc8250_1352511746"/>
+      <w:bookmarkEnd w:id="41"/>
       <w:r>
         <w:rPr/>
         <w:t>4.2 PX-118 paired model comparison</w:t>
@@ -3976,11 +5487,11 @@
         <w:pStyle w:val="GWUTableCaption"/>
         <w:rPr/>
       </w:pPr>
-      <w:bookmarkStart w:id="34" w:name="__RefHeading___Toc3540_1352511746"/>
-      <w:bookmarkEnd w:id="34"/>
+      <w:bookmarkStart w:id="42" w:name="__RefHeading___Toc8306_1352511746"/>
+      <w:bookmarkEnd w:id="42"/>
       <w:r>
         <w:rPr/>
-        <w:t>Table 5. PX-118 main development results</w:t>
+        <w:t>Table 8. PX-118 main development results</w:t>
       </w:r>
     </w:p>
     <w:tbl>
@@ -4810,11 +6321,11 @@
         <w:pStyle w:val="GWUTableCaption"/>
         <w:rPr/>
       </w:pPr>
-      <w:bookmarkStart w:id="35" w:name="__RefHeading___Toc3538_1352511746"/>
-      <w:bookmarkEnd w:id="35"/>
+      <w:bookmarkStart w:id="43" w:name="__RefHeading___Toc8304_1352511746"/>
+      <w:bookmarkEnd w:id="43"/>
       <w:r>
         <w:rPr/>
-        <w:t>Table 6. AI recall under held-out families</w:t>
+        <w:t>Table 9. AI recall under held-out families</w:t>
       </w:r>
     </w:p>
     <w:tbl>
@@ -5624,8 +7135,8 @@
         <w:pStyle w:val="Heading2"/>
         <w:rPr/>
       </w:pPr>
-      <w:bookmarkStart w:id="36" w:name="__RefHeading___Toc3504_1352511746"/>
-      <w:bookmarkEnd w:id="36"/>
+      <w:bookmarkStart w:id="44" w:name="__RefHeading___Toc8252_1352511746"/>
+      <w:bookmarkEnd w:id="44"/>
       <w:r>
         <w:rPr/>
         <w:t>4.3 Argument removal and score explanations</w:t>
@@ -5636,11 +7147,11 @@
         <w:pStyle w:val="GWUTableCaption"/>
         <w:rPr/>
       </w:pPr>
-      <w:bookmarkStart w:id="37" w:name="__RefHeading___Toc3536_1352511746"/>
-      <w:bookmarkEnd w:id="37"/>
+      <w:bookmarkStart w:id="45" w:name="__RefHeading___Toc8302_1352511746"/>
+      <w:bookmarkEnd w:id="45"/>
       <w:r>
         <w:rPr/>
-        <w:t>Table 7. Frozen-model argument-removal stress test</w:t>
+        <w:t>Table 10. Frozen-model argument-removal stress test</w:t>
       </w:r>
     </w:p>
     <w:tbl>
@@ -6312,8 +7823,8 @@
         <w:pStyle w:val="Heading2"/>
         <w:rPr/>
       </w:pPr>
-      <w:bookmarkStart w:id="38" w:name="__RefHeading___Toc3506_1352511746"/>
-      <w:bookmarkEnd w:id="38"/>
+      <w:bookmarkStart w:id="46" w:name="__RefHeading___Toc8254_1352511746"/>
+      <w:bookmarkEnd w:id="46"/>
       <w:r>
         <w:rPr/>
         <w:t>4.4 External-source eligibility and outcomes</w:t>
@@ -6324,11 +7835,11 @@
         <w:pStyle w:val="GWUTableCaption"/>
         <w:rPr/>
       </w:pPr>
-      <w:bookmarkStart w:id="39" w:name="__RefHeading___Toc3534_1352511746"/>
-      <w:bookmarkEnd w:id="39"/>
+      <w:bookmarkStart w:id="47" w:name="__RefHeading___Toc8300_1352511746"/>
+      <w:bookmarkEnd w:id="47"/>
       <w:r>
         <w:rPr/>
-        <w:t>Table 8. Rouxii qualification</w:t>
+        <w:t>Table 11. Rouxii qualification</w:t>
       </w:r>
     </w:p>
     <w:tbl>
@@ -6648,11 +8159,11 @@
         <w:pStyle w:val="GWUTableCaption"/>
         <w:rPr/>
       </w:pPr>
-      <w:bookmarkStart w:id="40" w:name="__RefHeading___Toc3532_1352511746"/>
-      <w:bookmarkEnd w:id="40"/>
+      <w:bookmarkStart w:id="48" w:name="__RefHeading___Toc8298_1352511746"/>
+      <w:bookmarkEnd w:id="48"/>
       <w:r>
         <w:rPr/>
-        <w:t>Table 9. Independent-source probes</w:t>
+        <w:t>Table 12. Independent-source probes</w:t>
       </w:r>
     </w:p>
     <w:tbl>
@@ -7156,8 +8667,8 @@
         <w:pStyle w:val="Heading2"/>
         <w:rPr/>
       </w:pPr>
-      <w:bookmarkStart w:id="41" w:name="__RefHeading___Toc3508_1352511746"/>
-      <w:bookmarkEnd w:id="41"/>
+      <w:bookmarkStart w:id="49" w:name="__RefHeading___Toc8256_1352511746"/>
+      <w:bookmarkEnd w:id="49"/>
       <w:r>
         <w:rPr/>
         <w:t>4.5 What remains untested</w:t>
@@ -7171,6 +8682,737 @@
       <w:r>
         <w:rPr/>
         <w:t>H1, H2 and H3 remain open: a fresh environment containing both classes under the same recorder has not been tested. Numerical development success does not establish transfer or analyst benefit.</w:t>
+      </w:r>
+    </w:p>
+    <w:p>
+      <w:pPr>
+        <w:pStyle w:val="Heading2"/>
+        <w:rPr/>
+      </w:pPr>
+      <w:bookmarkStart w:id="50" w:name="__RefHeading___Toc8258_1352511746"/>
+      <w:bookmarkEnd w:id="50"/>
+      <w:r>
+        <w:rPr/>
+        <w:t>4.6 Argument-count dependence: PX-119</w:t>
+      </w:r>
+    </w:p>
+    <w:p>
+      <w:pPr>
+        <w:pStyle w:val="GWUTableCaption"/>
+        <w:rPr/>
+      </w:pPr>
+      <w:bookmarkStart w:id="51" w:name="__RefHeading___Toc8296_1352511746"/>
+      <w:bookmarkEnd w:id="51"/>
+      <w:r>
+        <w:rPr/>
+        <w:t>Table 13. Argument-count diagnostic on the same development test</w:t>
+      </w:r>
+    </w:p>
+    <w:tbl>
+      <w:tblPr>
+        <w:tblW w:w="8640" w:type="dxa"/>
+        <w:jc w:val="start"/>
+        <w:tblInd w:w="108" w:type="dxa"/>
+        <w:tblLayout w:type="fixed"/>
+        <w:tblCellMar>
+          <w:top w:w="0" w:type="dxa"/>
+          <w:start w:w="108" w:type="dxa"/>
+          <w:bottom w:w="0" w:type="dxa"/>
+          <w:end w:w="108" w:type="dxa"/>
+        </w:tblCellMar>
+        <w:tblLook w:val="04a0" w:firstRow="1" w:noVBand="1" w:lastRow="0" w:firstColumn="1" w:lastColumn="0" w:noHBand="0"/>
+      </w:tblPr>
+      <w:tblGrid>
+        <w:gridCol w:w="2160"/>
+        <w:gridCol w:w="2160"/>
+        <w:gridCol w:w="2160"/>
+        <w:gridCol w:w="2160"/>
+      </w:tblGrid>
+      <w:tr>
+        <w:trPr>
+          <w:tblHeader w:val="true"/>
+        </w:trPr>
+        <w:tc>
+          <w:tcPr>
+            <w:tcW w:w="2160" w:type="dxa"/>
+            <w:tcBorders/>
+          </w:tcPr>
+          <w:p>
+            <w:pPr>
+              <w:pStyle w:val="Normal"/>
+              <w:keepNext w:val="true"/>
+              <w:spacing w:lineRule="auto" w:line="240" w:before="0" w:after="120"/>
+              <w:ind w:hanging="0"/>
+              <w:rPr/>
+            </w:pPr>
+            <w:r>
+              <w:rPr>
+                <w:sz w:val="20"/>
+              </w:rPr>
+              <w:t>Representation</w:t>
+            </w:r>
+          </w:p>
+        </w:tc>
+        <w:tc>
+          <w:tcPr>
+            <w:tcW w:w="2160" w:type="dxa"/>
+            <w:tcBorders/>
+          </w:tcPr>
+          <w:p>
+            <w:pPr>
+              <w:pStyle w:val="Normal"/>
+              <w:keepNext w:val="true"/>
+              <w:spacing w:lineRule="auto" w:line="240" w:before="0" w:after="120"/>
+              <w:ind w:hanging="0"/>
+              <w:rPr/>
+            </w:pPr>
+            <w:r>
+              <w:rPr>
+                <w:sz w:val="20"/>
+              </w:rPr>
+              <w:t>AI recall</w:t>
+            </w:r>
+          </w:p>
+        </w:tc>
+        <w:tc>
+          <w:tcPr>
+            <w:tcW w:w="2160" w:type="dxa"/>
+            <w:tcBorders/>
+          </w:tcPr>
+          <w:p>
+            <w:pPr>
+              <w:pStyle w:val="Normal"/>
+              <w:keepNext w:val="true"/>
+              <w:spacing w:lineRule="auto" w:line="240" w:before="0" w:after="120"/>
+              <w:ind w:hanging="0"/>
+              <w:rPr/>
+            </w:pPr>
+            <w:r>
+              <w:rPr>
+                <w:sz w:val="20"/>
+              </w:rPr>
+              <w:t>Human errors</w:t>
+            </w:r>
+          </w:p>
+        </w:tc>
+        <w:tc>
+          <w:tcPr>
+            <w:tcW w:w="2160" w:type="dxa"/>
+            <w:tcBorders/>
+          </w:tcPr>
+          <w:p>
+            <w:pPr>
+              <w:pStyle w:val="Normal"/>
+              <w:keepNext w:val="true"/>
+              <w:spacing w:lineRule="auto" w:line="240" w:before="0" w:after="120"/>
+              <w:ind w:hanging="0"/>
+              <w:rPr/>
+            </w:pPr>
+            <w:r>
+              <w:rPr>
+                <w:sz w:val="20"/>
+              </w:rPr>
+              <w:t>Group FPR</w:t>
+            </w:r>
+          </w:p>
+        </w:tc>
+      </w:tr>
+      <w:tr>
+        <w:trPr>
+          <w:cantSplit/>
+        </w:trPr>
+        <w:tc>
+          <w:tcPr>
+            <w:tcW w:w="2160" w:type="dxa"/>
+            <w:tcBorders/>
+          </w:tcPr>
+          <w:p>
+            <w:pPr>
+              <w:pStyle w:val="Normal"/>
+              <w:keepNext w:val="true"/>
+              <w:spacing w:lineRule="auto" w:line="240" w:before="0" w:after="120"/>
+              <w:ind w:hanging="0"/>
+              <w:rPr/>
+            </w:pPr>
+            <w:r>
+              <w:rPr>
+                <w:sz w:val="20"/>
+              </w:rPr>
+              <w:t>argument_counts</w:t>
+            </w:r>
+          </w:p>
+        </w:tc>
+        <w:tc>
+          <w:tcPr>
+            <w:tcW w:w="2160" w:type="dxa"/>
+            <w:tcBorders/>
+          </w:tcPr>
+          <w:p>
+            <w:pPr>
+              <w:pStyle w:val="Normal"/>
+              <w:keepNext w:val="true"/>
+              <w:spacing w:lineRule="auto" w:line="240" w:before="0" w:after="120"/>
+              <w:ind w:hanging="0"/>
+              <w:rPr/>
+            </w:pPr>
+            <w:r>
+              <w:rPr>
+                <w:sz w:val="20"/>
+              </w:rPr>
+              <w:t>11.46%</w:t>
+            </w:r>
+          </w:p>
+        </w:tc>
+        <w:tc>
+          <w:tcPr>
+            <w:tcW w:w="2160" w:type="dxa"/>
+            <w:tcBorders/>
+          </w:tcPr>
+          <w:p>
+            <w:pPr>
+              <w:pStyle w:val="Normal"/>
+              <w:keepNext w:val="true"/>
+              <w:spacing w:lineRule="auto" w:line="240" w:before="0" w:after="120"/>
+              <w:ind w:hanging="0"/>
+              <w:rPr/>
+            </w:pPr>
+            <w:r>
+              <w:rPr>
+                <w:sz w:val="20"/>
+              </w:rPr>
+              <w:t>2/61</w:t>
+            </w:r>
+          </w:p>
+        </w:tc>
+        <w:tc>
+          <w:tcPr>
+            <w:tcW w:w="2160" w:type="dxa"/>
+            <w:tcBorders/>
+          </w:tcPr>
+          <w:p>
+            <w:pPr>
+              <w:pStyle w:val="Normal"/>
+              <w:keepNext w:val="true"/>
+              <w:spacing w:lineRule="auto" w:line="240" w:before="0" w:after="120"/>
+              <w:ind w:hanging="0"/>
+              <w:rPr/>
+            </w:pPr>
+            <w:r>
+              <w:rPr>
+                <w:sz w:val="20"/>
+              </w:rPr>
+              <w:t>1.85%</w:t>
+            </w:r>
+          </w:p>
+        </w:tc>
+      </w:tr>
+      <w:tr>
+        <w:trPr>
+          <w:cantSplit/>
+        </w:trPr>
+        <w:tc>
+          <w:tcPr>
+            <w:tcW w:w="2160" w:type="dxa"/>
+            <w:tcBorders/>
+          </w:tcPr>
+          <w:p>
+            <w:pPr>
+              <w:pStyle w:val="Normal"/>
+              <w:keepNext w:val="true"/>
+              <w:spacing w:lineRule="auto" w:line="240" w:before="0" w:after="120"/>
+              <w:ind w:hanging="0"/>
+              <w:rPr/>
+            </w:pPr>
+            <w:r>
+              <w:rPr>
+                <w:sz w:val="20"/>
+              </w:rPr>
+              <w:t>argument_summary</w:t>
+            </w:r>
+          </w:p>
+        </w:tc>
+        <w:tc>
+          <w:tcPr>
+            <w:tcW w:w="2160" w:type="dxa"/>
+            <w:tcBorders/>
+          </w:tcPr>
+          <w:p>
+            <w:pPr>
+              <w:pStyle w:val="Normal"/>
+              <w:keepNext w:val="true"/>
+              <w:spacing w:lineRule="auto" w:line="240" w:before="0" w:after="120"/>
+              <w:ind w:hanging="0"/>
+              <w:rPr/>
+            </w:pPr>
+            <w:r>
+              <w:rPr>
+                <w:sz w:val="20"/>
+              </w:rPr>
+              <w:t>0.00%</w:t>
+            </w:r>
+          </w:p>
+        </w:tc>
+        <w:tc>
+          <w:tcPr>
+            <w:tcW w:w="2160" w:type="dxa"/>
+            <w:tcBorders/>
+          </w:tcPr>
+          <w:p>
+            <w:pPr>
+              <w:pStyle w:val="Normal"/>
+              <w:keepNext w:val="true"/>
+              <w:spacing w:lineRule="auto" w:line="240" w:before="0" w:after="120"/>
+              <w:ind w:hanging="0"/>
+              <w:rPr/>
+            </w:pPr>
+            <w:r>
+              <w:rPr>
+                <w:sz w:val="20"/>
+              </w:rPr>
+              <w:t>0/61</w:t>
+            </w:r>
+          </w:p>
+        </w:tc>
+        <w:tc>
+          <w:tcPr>
+            <w:tcW w:w="2160" w:type="dxa"/>
+            <w:tcBorders/>
+          </w:tcPr>
+          <w:p>
+            <w:pPr>
+              <w:pStyle w:val="Normal"/>
+              <w:keepNext w:val="true"/>
+              <w:spacing w:lineRule="auto" w:line="240" w:before="0" w:after="120"/>
+              <w:ind w:hanging="0"/>
+              <w:rPr/>
+            </w:pPr>
+            <w:r>
+              <w:rPr>
+                <w:sz w:val="20"/>
+              </w:rPr>
+              <w:t>0.00%</w:t>
+            </w:r>
+          </w:p>
+        </w:tc>
+      </w:tr>
+      <w:tr>
+        <w:trPr>
+          <w:cantSplit/>
+        </w:trPr>
+        <w:tc>
+          <w:tcPr>
+            <w:tcW w:w="2160" w:type="dxa"/>
+            <w:tcBorders/>
+          </w:tcPr>
+          <w:p>
+            <w:pPr>
+              <w:pStyle w:val="Normal"/>
+              <w:keepNext w:val="false"/>
+              <w:spacing w:lineRule="auto" w:line="240" w:before="0" w:after="120"/>
+              <w:ind w:hanging="0"/>
+              <w:rPr/>
+            </w:pPr>
+            <w:r>
+              <w:rPr>
+                <w:sz w:val="20"/>
+              </w:rPr>
+              <w:t>one_marker</w:t>
+            </w:r>
+          </w:p>
+        </w:tc>
+        <w:tc>
+          <w:tcPr>
+            <w:tcW w:w="2160" w:type="dxa"/>
+            <w:tcBorders/>
+          </w:tcPr>
+          <w:p>
+            <w:pPr>
+              <w:pStyle w:val="Normal"/>
+              <w:keepNext w:val="false"/>
+              <w:spacing w:lineRule="auto" w:line="240" w:before="0" w:after="120"/>
+              <w:ind w:hanging="0"/>
+              <w:rPr/>
+            </w:pPr>
+            <w:r>
+              <w:rPr>
+                <w:sz w:val="20"/>
+              </w:rPr>
+              <w:t>79.77%</w:t>
+            </w:r>
+          </w:p>
+        </w:tc>
+        <w:tc>
+          <w:tcPr>
+            <w:tcW w:w="2160" w:type="dxa"/>
+            <w:tcBorders/>
+          </w:tcPr>
+          <w:p>
+            <w:pPr>
+              <w:pStyle w:val="Normal"/>
+              <w:keepNext w:val="false"/>
+              <w:spacing w:lineRule="auto" w:line="240" w:before="0" w:after="120"/>
+              <w:ind w:hanging="0"/>
+              <w:rPr/>
+            </w:pPr>
+            <w:r>
+              <w:rPr>
+                <w:sz w:val="20"/>
+              </w:rPr>
+              <w:t>3/61</w:t>
+            </w:r>
+          </w:p>
+        </w:tc>
+        <w:tc>
+          <w:tcPr>
+            <w:tcW w:w="2160" w:type="dxa"/>
+            <w:tcBorders/>
+          </w:tcPr>
+          <w:p>
+            <w:pPr>
+              <w:pStyle w:val="Normal"/>
+              <w:keepNext w:val="false"/>
+              <w:spacing w:lineRule="auto" w:line="240" w:before="0" w:after="120"/>
+              <w:ind w:hanging="0"/>
+              <w:rPr/>
+            </w:pPr>
+            <w:r>
+              <w:rPr>
+                <w:sz w:val="20"/>
+              </w:rPr>
+              <w:t>4.32%</w:t>
+            </w:r>
+          </w:p>
+        </w:tc>
+      </w:tr>
+    </w:tbl>
+    <w:p>
+      <w:pPr>
+        <w:pStyle w:val="Normal"/>
+        <w:rPr/>
+      </w:pPr>
+      <w:r>
+        <w:rPr/>
+        <w:t>Counts alone recover 11.46% of AI windows. The order-free count summaries recover none at their calibration threshold, despite test AUROC of 0.894. A ranking score alone therefore does not demonstrate usefulness at the chosen operating point. The retrained one-marker model reaches 79.77% recall and 4.32% mean human-group FPR, narrowly missing the 80% recall target. Its KYPO false labels are 2/180; positional counts produce 36/180. These external checks remain conditional on eligible training-task records.</w:t>
+      </w:r>
+    </w:p>
+    <w:p>
+      <w:pPr>
+        <w:pStyle w:val="GWUFigureCaption"/>
+        <w:rPr/>
+      </w:pPr>
+      <w:bookmarkStart w:id="52" w:name="__RefHeading___Toc8285_1352511746"/>
+      <w:bookmarkEnd w:id="52"/>
+      <w:r>
+        <w:rPr/>
+        <w:t>Figure 3. Argument-count intervention and retrained controls</w:t>
+      </w:r>
+    </w:p>
+    <w:p>
+      <w:pPr>
+        <w:pStyle w:val="Normal"/>
+        <w:rPr/>
+      </w:pPr>
+      <w:r>
+        <w:rPr/>
+        <w:drawing>
+          <wp:inline distT="0" distB="0" distL="0" distR="0">
+            <wp:extent cx="5303520" cy="2799080"/>
+            <wp:effectExtent l="0" t="0" r="0" b="0"/>
+            <wp:docPr id="3" name="Picture 3"/>
+            <wp:cNvGraphicFramePr>
+              <a:graphicFrameLocks xmlns:a="http://schemas.openxmlformats.org/drawingml/2006/main" noChangeAspect="1"/>
+            </wp:cNvGraphicFramePr>
+            <a:graphic xmlns:a="http://schemas.openxmlformats.org/drawingml/2006/main">
+              <a:graphicData uri="http://schemas.openxmlformats.org/drawingml/2006/picture">
+                <pic:pic xmlns:pic="http://schemas.openxmlformats.org/drawingml/2006/picture">
+                  <pic:nvPicPr>
+                    <pic:cNvPr id="3" name="Picture 3"/>
+                    <pic:cNvPicPr>
+                      <a:picLocks noChangeAspect="1" noChangeArrowheads="1"/>
+                    </pic:cNvPicPr>
+                  </pic:nvPicPr>
+                  <pic:blipFill>
+                    <a:blip r:embed="rId7"/>
+                    <a:stretch>
+                      <a:fillRect/>
+                    </a:stretch>
+                  </pic:blipFill>
+                  <pic:spPr bwMode="auto">
+                    <a:xfrm>
+                      <a:off x="0" y="0"/>
+                      <a:ext cx="5303520" cy="2799080"/>
+                    </a:xfrm>
+                    <a:prstGeom prst="rect">
+                      <a:avLst/>
+                    </a:prstGeom>
+                    <a:noFill/>
+                  </pic:spPr>
+                </pic:pic>
+              </a:graphicData>
+            </a:graphic>
+          </wp:inline>
+        </w:drawing>
+      </w:r>
+    </w:p>
+    <w:p>
+      <w:pPr>
+        <w:pStyle w:val="Normal"/>
+        <w:rPr/>
+      </w:pPr>
+      <w:r>
+        <w:rPr/>
+        <w:t>When the frozen masked model receives equalized argument counts, its recall changes from 92.85% to 90.92%, but human false labels rise from 0/61 to 30/61. Mean human-group FPR rises to 50.93%, and 9.92% of all decisions change. This demonstrates sensitivity to count-related representation changes. It does not establish that count alone explains the original result, nor that argument count is inherently an invalid feature. The intervention changes the input distribution; the matched study must determine whether the dependence transfers.</w:t>
+      </w:r>
+    </w:p>
+    <w:p>
+      <w:pPr>
+        <w:pStyle w:val="Normal"/>
+        <w:rPr/>
+      </w:pPr>
+      <w:r>
+        <w:rPr/>
+        <w:t>Of the original masked model's 93 AI misses, 74 are Alibaba, 14 Meta and 5 Google. The corresponding main-test denominators are 705, 240 and 351; DeepSeek has only four main-test records and no misses. These are the main-test slices, not the larger family-exclusion tests. Concentration of errors is useful for diagnosis but does not justify family-specific threshold tuning on this test.</w:t>
+      </w:r>
+    </w:p>
+    <w:p>
+      <w:pPr>
+        <w:pStyle w:val="Heading2"/>
+        <w:rPr/>
+      </w:pPr>
+      <w:bookmarkStart w:id="53" w:name="__RefHeading___Toc8260_1352511746"/>
+      <w:bookmarkEnd w:id="53"/>
+      <w:r>
+        <w:rPr/>
+        <w:t>4.7 Hypothesis status and practical interpretation</w:t>
+      </w:r>
+    </w:p>
+    <w:p>
+      <w:pPr>
+        <w:pStyle w:val="GWUTableCaption"/>
+        <w:rPr/>
+      </w:pPr>
+      <w:bookmarkStart w:id="54" w:name="__RefHeading___Toc8294_1352511746"/>
+      <w:bookmarkEnd w:id="54"/>
+      <w:r>
+        <w:rPr/>
+        <w:t>Table 14. Status of proposed confirmatory hypotheses</w:t>
+      </w:r>
+    </w:p>
+    <w:tbl>
+      <w:tblPr>
+        <w:tblW w:w="8640" w:type="dxa"/>
+        <w:jc w:val="start"/>
+        <w:tblInd w:w="108" w:type="dxa"/>
+        <w:tblLayout w:type="fixed"/>
+        <w:tblCellMar>
+          <w:top w:w="0" w:type="dxa"/>
+          <w:start w:w="108" w:type="dxa"/>
+          <w:bottom w:w="0" w:type="dxa"/>
+          <w:end w:w="108" w:type="dxa"/>
+        </w:tblCellMar>
+        <w:tblLook w:val="04a0" w:firstRow="1" w:noVBand="1" w:lastRow="0" w:firstColumn="1" w:lastColumn="0" w:noHBand="0"/>
+      </w:tblPr>
+      <w:tblGrid>
+        <w:gridCol w:w="4320"/>
+        <w:gridCol w:w="4320"/>
+      </w:tblGrid>
+      <w:tr>
+        <w:trPr>
+          <w:tblHeader w:val="true"/>
+        </w:trPr>
+        <w:tc>
+          <w:tcPr>
+            <w:tcW w:w="4320" w:type="dxa"/>
+            <w:tcBorders/>
+          </w:tcPr>
+          <w:p>
+            <w:pPr>
+              <w:pStyle w:val="Normal"/>
+              <w:keepNext w:val="true"/>
+              <w:spacing w:lineRule="auto" w:line="240" w:before="0" w:after="120"/>
+              <w:ind w:hanging="0"/>
+              <w:rPr/>
+            </w:pPr>
+            <w:r>
+              <w:rPr>
+                <w:sz w:val="20"/>
+              </w:rPr>
+              <w:t>Hypothesis</w:t>
+            </w:r>
+          </w:p>
+        </w:tc>
+        <w:tc>
+          <w:tcPr>
+            <w:tcW w:w="4320" w:type="dxa"/>
+            <w:tcBorders/>
+          </w:tcPr>
+          <w:p>
+            <w:pPr>
+              <w:pStyle w:val="Normal"/>
+              <w:keepNext w:val="true"/>
+              <w:spacing w:lineRule="auto" w:line="240" w:before="0" w:after="120"/>
+              <w:ind w:hanging="0"/>
+              <w:rPr/>
+            </w:pPr>
+            <w:r>
+              <w:rPr>
+                <w:sz w:val="20"/>
+              </w:rPr>
+              <w:t>Current status</w:t>
+            </w:r>
+          </w:p>
+        </w:tc>
+      </w:tr>
+      <w:tr>
+        <w:trPr>
+          <w:cantSplit/>
+        </w:trPr>
+        <w:tc>
+          <w:tcPr>
+            <w:tcW w:w="4320" w:type="dxa"/>
+            <w:tcBorders/>
+          </w:tcPr>
+          <w:p>
+            <w:pPr>
+              <w:pStyle w:val="Normal"/>
+              <w:keepNext w:val="true"/>
+              <w:spacing w:lineRule="auto" w:line="240" w:before="0" w:after="120"/>
+              <w:ind w:hanging="0"/>
+              <w:rPr/>
+            </w:pPr>
+            <w:r>
+              <w:rPr>
+                <w:sz w:val="20"/>
+              </w:rPr>
+              <w:t>H1: fresh matched transfer</w:t>
+            </w:r>
+          </w:p>
+        </w:tc>
+        <w:tc>
+          <w:tcPr>
+            <w:tcW w:w="4320" w:type="dxa"/>
+            <w:tcBorders/>
+          </w:tcPr>
+          <w:p>
+            <w:pPr>
+              <w:pStyle w:val="Normal"/>
+              <w:keepNext w:val="true"/>
+              <w:spacing w:lineRule="auto" w:line="240" w:before="0" w:after="120"/>
+              <w:ind w:hanging="0"/>
+              <w:rPr/>
+            </w:pPr>
+            <w:r>
+              <w:rPr>
+                <w:sz w:val="20"/>
+              </w:rPr>
+              <w:t>Not tested: matched evaluation not collected.</w:t>
+            </w:r>
+          </w:p>
+        </w:tc>
+      </w:tr>
+      <w:tr>
+        <w:trPr>
+          <w:cantSplit/>
+        </w:trPr>
+        <w:tc>
+          <w:tcPr>
+            <w:tcW w:w="4320" w:type="dxa"/>
+            <w:tcBorders/>
+          </w:tcPr>
+          <w:p>
+            <w:pPr>
+              <w:pStyle w:val="Normal"/>
+              <w:keepNext w:val="true"/>
+              <w:spacing w:lineRule="auto" w:line="240" w:before="0" w:after="120"/>
+              <w:ind w:hanging="0"/>
+              <w:rPr/>
+            </w:pPr>
+            <w:r>
+              <w:rPr>
+                <w:sz w:val="20"/>
+              </w:rPr>
+              <w:t>H2: masking improves transfer at a human-error limit</w:t>
+            </w:r>
+          </w:p>
+        </w:tc>
+        <w:tc>
+          <w:tcPr>
+            <w:tcW w:w="4320" w:type="dxa"/>
+            <w:tcBorders/>
+          </w:tcPr>
+          <w:p>
+            <w:pPr>
+              <w:pStyle w:val="Normal"/>
+              <w:keepNext w:val="true"/>
+              <w:spacing w:lineRule="auto" w:line="240" w:before="0" w:after="120"/>
+              <w:ind w:hanging="0"/>
+              <w:rPr/>
+            </w:pPr>
+            <w:r>
+              <w:rPr>
+                <w:sz w:val="20"/>
+              </w:rPr>
+              <w:t>Not tested on fresh data; PX-118/119 are diagnostics.</w:t>
+            </w:r>
+          </w:p>
+        </w:tc>
+      </w:tr>
+      <w:tr>
+        <w:trPr>
+          <w:cantSplit/>
+        </w:trPr>
+        <w:tc>
+          <w:tcPr>
+            <w:tcW w:w="4320" w:type="dxa"/>
+            <w:tcBorders/>
+          </w:tcPr>
+          <w:p>
+            <w:pPr>
+              <w:pStyle w:val="Normal"/>
+              <w:keepNext w:val="false"/>
+              <w:spacing w:lineRule="auto" w:line="240" w:before="0" w:after="120"/>
+              <w:ind w:hanging="0"/>
+              <w:rPr/>
+            </w:pPr>
+            <w:r>
+              <w:rPr>
+                <w:sz w:val="20"/>
+              </w:rPr>
+              <w:t>H3: validated irrelevant renaming preserves explanations</w:t>
+            </w:r>
+          </w:p>
+        </w:tc>
+        <w:tc>
+          <w:tcPr>
+            <w:tcW w:w="4320" w:type="dxa"/>
+            <w:tcBorders/>
+          </w:tcPr>
+          <w:p>
+            <w:pPr>
+              <w:pStyle w:val="Normal"/>
+              <w:keepNext w:val="false"/>
+              <w:spacing w:lineRule="auto" w:line="240" w:before="0" w:after="120"/>
+              <w:ind w:hanging="0"/>
+              <w:rPr/>
+            </w:pPr>
+            <w:r>
+              <w:rPr>
+                <w:sz w:val="20"/>
+              </w:rPr>
+              <w:t>Not tested: broad argument/count changes do not meet that definition.</w:t>
+            </w:r>
+          </w:p>
+        </w:tc>
+      </w:tr>
+    </w:tbl>
+    <w:p>
+      <w:pPr>
+        <w:pStyle w:val="Normal"/>
+        <w:rPr/>
+      </w:pPr>
+      <w:r>
+        <w:rPr/>
+        <w:t>No completed test establishes population-level operator attribution. With only nine conservative human groups, zero observed errors gives weak evidence about a low future error rate. The existing group bootstrap is conditional and degenerates at zero observed errors. A confirmatory analysis needs adequate independent operators, group-resampled intervals and an explicit decision rule agreed before evaluation.</w:t>
       </w:r>
     </w:p>
     <w:p>
@@ -7191,8 +9433,8 @@
         <w:spacing w:before="0" w:after="120"/>
         <w:rPr/>
       </w:pPr>
-      <w:bookmarkStart w:id="42" w:name="__RefHeading___Toc3510_1352511746"/>
-      <w:bookmarkEnd w:id="42"/>
+      <w:bookmarkStart w:id="55" w:name="__RefHeading___Toc8262_1352511746"/>
+      <w:bookmarkEnd w:id="55"/>
       <w:r>
         <w:rPr/>
         <w:t>Chapter 5: Discussion and Conclusions</w:t>
@@ -7203,8 +9445,8 @@
         <w:pStyle w:val="Heading2"/>
         <w:rPr/>
       </w:pPr>
-      <w:bookmarkStart w:id="43" w:name="__RefHeading___Toc3512_1352511746"/>
-      <w:bookmarkEnd w:id="43"/>
+      <w:bookmarkStart w:id="56" w:name="__RefHeading___Toc8264_1352511746"/>
+      <w:bookmarkEnd w:id="56"/>
       <w:r>
         <w:rPr/>
         <w:t>5.1 Interpretation</w:t>
@@ -7235,8 +9477,8 @@
         <w:pStyle w:val="Heading2"/>
         <w:rPr/>
       </w:pPr>
-      <w:bookmarkStart w:id="44" w:name="__RefHeading___Toc3514_1352511746"/>
-      <w:bookmarkEnd w:id="44"/>
+      <w:bookmarkStart w:id="57" w:name="__RefHeading___Toc8266_1352511746"/>
+      <w:bookmarkEnd w:id="57"/>
       <w:r>
         <w:rPr/>
         <w:t>5.2 Engineering product and proposed contribution</w:t>
@@ -7267,8 +9509,8 @@
         <w:pStyle w:val="Heading2"/>
         <w:rPr/>
       </w:pPr>
-      <w:bookmarkStart w:id="45" w:name="__RefHeading___Toc3516_1352511746"/>
-      <w:bookmarkEnd w:id="45"/>
+      <w:bookmarkStart w:id="58" w:name="__RefHeading___Toc8268_1352511746"/>
+      <w:bookmarkEnd w:id="58"/>
       <w:r>
         <w:rPr/>
         <w:t>5.3 Decisions for the next phase</w:t>
@@ -7299,8 +9541,8 @@
         <w:pStyle w:val="Heading2"/>
         <w:rPr/>
       </w:pPr>
-      <w:bookmarkStart w:id="46" w:name="__RefHeading___Toc3518_1352511746"/>
-      <w:bookmarkEnd w:id="46"/>
+      <w:bookmarkStart w:id="59" w:name="__RefHeading___Toc8270_1352511746"/>
+      <w:bookmarkEnd w:id="59"/>
       <w:r>
         <w:rPr/>
         <w:t>5.4 Conclusion</w:t>
@@ -7314,6 +9556,398 @@
       <w:r>
         <w:rPr/>
         <w:t>This Praxis has a plausible research direction and completed development evidence, but transfer is not yet established. The present package makes that uncertainty measurable and specifies the data needed to resolve it. Success will mean detecting autonomous AI on fresh matched conditions while limiting human false labels and showing which command evidence supports each decision.</w:t>
+      </w:r>
+    </w:p>
+    <w:p>
+      <w:pPr>
+        <w:pStyle w:val="Heading2"/>
+        <w:rPr/>
+      </w:pPr>
+      <w:bookmarkStart w:id="60" w:name="__RefHeading___Toc8272_1352511746"/>
+      <w:bookmarkEnd w:id="60"/>
+      <w:r>
+        <w:rPr/>
+        <w:t>5.5 Work remaining before a defense claim</w:t>
+      </w:r>
+    </w:p>
+    <w:p>
+      <w:pPr>
+        <w:pStyle w:val="GWUTableCaption"/>
+        <w:rPr/>
+      </w:pPr>
+      <w:bookmarkStart w:id="61" w:name="__RefHeading___Toc8292_1352511746"/>
+      <w:bookmarkEnd w:id="61"/>
+      <w:r>
+        <w:rPr/>
+        <w:t>Table 15. Remaining work and completion evidence</w:t>
+      </w:r>
+    </w:p>
+    <w:tbl>
+      <w:tblPr>
+        <w:tblW w:w="8640" w:type="dxa"/>
+        <w:jc w:val="start"/>
+        <w:tblInd w:w="108" w:type="dxa"/>
+        <w:tblLayout w:type="fixed"/>
+        <w:tblCellMar>
+          <w:top w:w="0" w:type="dxa"/>
+          <w:start w:w="108" w:type="dxa"/>
+          <w:bottom w:w="0" w:type="dxa"/>
+          <w:end w:w="108" w:type="dxa"/>
+        </w:tblCellMar>
+        <w:tblLook w:val="04a0" w:firstRow="1" w:noVBand="1" w:lastRow="0" w:firstColumn="1" w:lastColumn="0" w:noHBand="0"/>
+      </w:tblPr>
+      <w:tblGrid>
+        <w:gridCol w:w="4320"/>
+        <w:gridCol w:w="4320"/>
+      </w:tblGrid>
+      <w:tr>
+        <w:trPr>
+          <w:tblHeader w:val="true"/>
+        </w:trPr>
+        <w:tc>
+          <w:tcPr>
+            <w:tcW w:w="4320" w:type="dxa"/>
+            <w:tcBorders/>
+          </w:tcPr>
+          <w:p>
+            <w:pPr>
+              <w:pStyle w:val="Normal"/>
+              <w:keepNext w:val="true"/>
+              <w:spacing w:lineRule="auto" w:line="240" w:before="0" w:after="120"/>
+              <w:ind w:hanging="0"/>
+              <w:rPr/>
+            </w:pPr>
+            <w:r>
+              <w:rPr>
+                <w:sz w:val="20"/>
+              </w:rPr>
+              <w:t>Work item</w:t>
+            </w:r>
+          </w:p>
+        </w:tc>
+        <w:tc>
+          <w:tcPr>
+            <w:tcW w:w="4320" w:type="dxa"/>
+            <w:tcBorders/>
+          </w:tcPr>
+          <w:p>
+            <w:pPr>
+              <w:pStyle w:val="Normal"/>
+              <w:keepNext w:val="true"/>
+              <w:spacing w:lineRule="auto" w:line="240" w:before="0" w:after="120"/>
+              <w:ind w:hanging="0"/>
+              <w:rPr/>
+            </w:pPr>
+            <w:r>
+              <w:rPr>
+                <w:sz w:val="20"/>
+              </w:rPr>
+              <w:t>Required evidence</w:t>
+            </w:r>
+          </w:p>
+        </w:tc>
+      </w:tr>
+      <w:tr>
+        <w:trPr>
+          <w:cantSplit/>
+        </w:trPr>
+        <w:tc>
+          <w:tcPr>
+            <w:tcW w:w="4320" w:type="dxa"/>
+            <w:tcBorders/>
+          </w:tcPr>
+          <w:p>
+            <w:pPr>
+              <w:pStyle w:val="Normal"/>
+              <w:keepNext w:val="true"/>
+              <w:spacing w:lineRule="auto" w:line="240" w:before="0" w:after="120"/>
+              <w:ind w:hanging="0"/>
+              <w:rPr/>
+            </w:pPr>
+            <w:r>
+              <w:rPr>
+                <w:sz w:val="20"/>
+              </w:rPr>
+              <w:t>Matched collection</w:t>
+            </w:r>
+          </w:p>
+        </w:tc>
+        <w:tc>
+          <w:tcPr>
+            <w:tcW w:w="4320" w:type="dxa"/>
+            <w:tcBorders/>
+          </w:tcPr>
+          <w:p>
+            <w:pPr>
+              <w:pStyle w:val="Normal"/>
+              <w:keepNext w:val="true"/>
+              <w:spacing w:lineRule="auto" w:line="240" w:before="0" w:after="120"/>
+              <w:ind w:hanging="0"/>
+              <w:rPr/>
+            </w:pPr>
+            <w:r>
+              <w:rPr>
+                <w:sz w:val="20"/>
+              </w:rPr>
+              <w:t>Institutional determination; recruited humans; autonomous runs on identical tasks and recorder.</w:t>
+            </w:r>
+          </w:p>
+        </w:tc>
+      </w:tr>
+      <w:tr>
+        <w:trPr>
+          <w:cantSplit/>
+        </w:trPr>
+        <w:tc>
+          <w:tcPr>
+            <w:tcW w:w="4320" w:type="dxa"/>
+            <w:tcBorders/>
+          </w:tcPr>
+          <w:p>
+            <w:pPr>
+              <w:pStyle w:val="Normal"/>
+              <w:keepNext w:val="true"/>
+              <w:spacing w:lineRule="auto" w:line="240" w:before="0" w:after="120"/>
+              <w:ind w:hanging="0"/>
+              <w:rPr/>
+            </w:pPr>
+            <w:r>
+              <w:rPr>
+                <w:sz w:val="20"/>
+              </w:rPr>
+              <w:t>Collection implementation</w:t>
+            </w:r>
+          </w:p>
+        </w:tc>
+        <w:tc>
+          <w:tcPr>
+            <w:tcW w:w="4320" w:type="dxa"/>
+            <w:tcBorders/>
+          </w:tcPr>
+          <w:p>
+            <w:pPr>
+              <w:pStyle w:val="Normal"/>
+              <w:keepNext w:val="true"/>
+              <w:spacing w:lineRule="auto" w:line="240" w:before="0" w:after="120"/>
+              <w:ind w:hanging="0"/>
+              <w:rPr/>
+            </w:pPr>
+            <w:r>
+              <w:rPr>
+                <w:sz w:val="20"/>
+              </w:rPr>
+              <w:t>Task images, autonomous adapter and container integration tests; prototype is not a validated collection system.</w:t>
+            </w:r>
+          </w:p>
+        </w:tc>
+      </w:tr>
+      <w:tr>
+        <w:trPr>
+          <w:cantSplit/>
+        </w:trPr>
+        <w:tc>
+          <w:tcPr>
+            <w:tcW w:w="4320" w:type="dxa"/>
+            <w:tcBorders/>
+          </w:tcPr>
+          <w:p>
+            <w:pPr>
+              <w:pStyle w:val="Normal"/>
+              <w:keepNext w:val="true"/>
+              <w:spacing w:lineRule="auto" w:line="240" w:before="0" w:after="120"/>
+              <w:ind w:hanging="0"/>
+              <w:rPr/>
+            </w:pPr>
+            <w:r>
+              <w:rPr>
+                <w:sz w:val="20"/>
+              </w:rPr>
+              <w:t>Fresh evaluation</w:t>
+            </w:r>
+          </w:p>
+        </w:tc>
+        <w:tc>
+          <w:tcPr>
+            <w:tcW w:w="4320" w:type="dxa"/>
+            <w:tcBorders/>
+          </w:tcPr>
+          <w:p>
+            <w:pPr>
+              <w:pStyle w:val="Normal"/>
+              <w:keepNext w:val="true"/>
+              <w:spacing w:lineRule="auto" w:line="240" w:before="0" w:after="120"/>
+              <w:ind w:hanging="0"/>
+              <w:rPr/>
+            </w:pPr>
+            <w:r>
+              <w:rPr>
+                <w:sz w:val="20"/>
+              </w:rPr>
+              <w:t>Frozen selection, sample size, holdouts and thresholds; independent operators and unseen conditions.</w:t>
+            </w:r>
+          </w:p>
+        </w:tc>
+      </w:tr>
+      <w:tr>
+        <w:trPr>
+          <w:cantSplit/>
+        </w:trPr>
+        <w:tc>
+          <w:tcPr>
+            <w:tcW w:w="4320" w:type="dxa"/>
+            <w:tcBorders/>
+          </w:tcPr>
+          <w:p>
+            <w:pPr>
+              <w:pStyle w:val="Normal"/>
+              <w:keepNext w:val="true"/>
+              <w:spacing w:lineRule="auto" w:line="240" w:before="0" w:after="120"/>
+              <w:ind w:hanging="0"/>
+              <w:rPr/>
+            </w:pPr>
+            <w:r>
+              <w:rPr>
+                <w:sz w:val="20"/>
+              </w:rPr>
+              <w:t>Explanation validity</w:t>
+            </w:r>
+          </w:p>
+        </w:tc>
+        <w:tc>
+          <w:tcPr>
+            <w:tcW w:w="4320" w:type="dxa"/>
+            <w:tcBorders/>
+          </w:tcPr>
+          <w:p>
+            <w:pPr>
+              <w:pStyle w:val="Normal"/>
+              <w:keepNext w:val="true"/>
+              <w:spacing w:lineRule="auto" w:line="240" w:before="0" w:after="120"/>
+              <w:ind w:hanging="0"/>
+              <w:rPr/>
+            </w:pPr>
+            <w:r>
+              <w:rPr>
+                <w:sz w:val="20"/>
+              </w:rPr>
+              <w:t>Validated irrelevant-identifier interventions; errors and stability measured on fresh records.</w:t>
+            </w:r>
+          </w:p>
+        </w:tc>
+      </w:tr>
+      <w:tr>
+        <w:trPr>
+          <w:cantSplit/>
+        </w:trPr>
+        <w:tc>
+          <w:tcPr>
+            <w:tcW w:w="4320" w:type="dxa"/>
+            <w:tcBorders/>
+          </w:tcPr>
+          <w:p>
+            <w:pPr>
+              <w:pStyle w:val="Normal"/>
+              <w:keepNext w:val="true"/>
+              <w:spacing w:lineRule="auto" w:line="240" w:before="0" w:after="120"/>
+              <w:ind w:hanging="0"/>
+              <w:rPr/>
+            </w:pPr>
+            <w:r>
+              <w:rPr>
+                <w:sz w:val="20"/>
+              </w:rPr>
+              <w:t>Novelty and review</w:t>
+            </w:r>
+          </w:p>
+        </w:tc>
+        <w:tc>
+          <w:tcPr>
+            <w:tcW w:w="4320" w:type="dxa"/>
+            <w:tcBorders/>
+          </w:tcPr>
+          <w:p>
+            <w:pPr>
+              <w:pStyle w:val="Normal"/>
+              <w:keepNext w:val="true"/>
+              <w:spacing w:lineRule="auto" w:line="240" w:before="0" w:after="120"/>
+              <w:ind w:hanging="0"/>
+              <w:rPr/>
+            </w:pPr>
+            <w:r>
+              <w:rPr>
+                <w:sz w:val="20"/>
+              </w:rPr>
+              <w:t>Full closest papers, updated comparison and committee agreement on the narrow contribution.</w:t>
+            </w:r>
+          </w:p>
+        </w:tc>
+      </w:tr>
+      <w:tr>
+        <w:trPr>
+          <w:cantSplit/>
+        </w:trPr>
+        <w:tc>
+          <w:tcPr>
+            <w:tcW w:w="4320" w:type="dxa"/>
+            <w:tcBorders/>
+          </w:tcPr>
+          <w:p>
+            <w:pPr>
+              <w:pStyle w:val="Normal"/>
+              <w:keepNext w:val="false"/>
+              <w:spacing w:lineRule="auto" w:line="240" w:before="0" w:after="120"/>
+              <w:ind w:hanging="0"/>
+              <w:rPr/>
+            </w:pPr>
+            <w:r>
+              <w:rPr>
+                <w:sz w:val="20"/>
+              </w:rPr>
+              <w:t>Final manuscript</w:t>
+            </w:r>
+          </w:p>
+        </w:tc>
+        <w:tc>
+          <w:tcPr>
+            <w:tcW w:w="4320" w:type="dxa"/>
+            <w:tcBorders/>
+          </w:tcPr>
+          <w:p>
+            <w:pPr>
+              <w:pStyle w:val="Normal"/>
+              <w:keepNext w:val="false"/>
+              <w:spacing w:lineRule="auto" w:line="240" w:before="0" w:after="120"/>
+              <w:ind w:hanging="0"/>
+              <w:rPr/>
+            </w:pPr>
+            <w:r>
+              <w:rPr>
+                <w:sz w:val="20"/>
+              </w:rPr>
+              <w:t>Author verification, AI-use disclosure, committee metadata and approved submission format.</w:t>
+            </w:r>
+          </w:p>
+        </w:tc>
+      </w:tr>
+    </w:tbl>
+    <w:p>
+      <w:pPr>
+        <w:pStyle w:val="Normal"/>
+        <w:rPr/>
+      </w:pPr>
+      <w:r>
+        <w:rPr/>
+        <w:t>The next decision is whether to invest in a matched pilot. More tuning on the present sources cannot remove their class/source confounding. The pilot should estimate eligible-window yield, variability between operators and task effects before fixing the final sample size. The 80% recall and 5% human-error limits are proposed engineering targets, not universal SOC standards. They require stakeholder justification before confirmation.</w:t>
+      </w:r>
+    </w:p>
+    <w:p>
+      <w:pPr>
+        <w:pStyle w:val="Normal"/>
+        <w:rPr/>
+      </w:pPr>
+      <w:r>
+        <w:rPr/>
+        <w:t>For a hypothetical deployment with 1% AI windows, 80% sensitivity and 5% human FPR, only about 13.9% of AI labels would be correct. The formula is sensitivity times prevalence divided by that quantity plus FPR times one minus prevalence. This example uses assumed inputs; it is not an observed precision estimate. It explains why a useful triage label may require much lower human error than a balanced benchmark suggests.</w:t>
       </w:r>
     </w:p>
     <w:p>
@@ -7334,8 +9968,8 @@
         <w:spacing w:before="0" w:after="120"/>
         <w:rPr/>
       </w:pPr>
-      <w:bookmarkStart w:id="47" w:name="__RefHeading___Toc3520_1352511746"/>
-      <w:bookmarkEnd w:id="47"/>
+      <w:bookmarkStart w:id="62" w:name="__RefHeading___Toc8274_1352511746"/>
+      <w:bookmarkEnd w:id="62"/>
       <w:r>
         <w:rPr/>
         <w:t>References</w:t>
@@ -7467,8 +10101,8 @@
         <w:spacing w:before="0" w:after="120"/>
         <w:rPr/>
       </w:pPr>
-      <w:bookmarkStart w:id="48" w:name="__RefHeading___Toc3522_1352511746"/>
-      <w:bookmarkEnd w:id="48"/>
+      <w:bookmarkStart w:id="63" w:name="__RefHeading___Toc8276_1352511746"/>
+      <w:bookmarkEnd w:id="63"/>
       <w:r>
         <w:rPr/>
         <w:t>Appendix A: Evidence and Reproduction</w:t>
@@ -7522,8 +10156,8 @@
         <w:spacing w:before="0" w:after="120"/>
         <w:rPr/>
       </w:pPr>
-      <w:bookmarkStart w:id="49" w:name="__RefHeading___Toc3524_1352511746"/>
-      <w:bookmarkEnd w:id="49"/>
+      <w:bookmarkStart w:id="64" w:name="__RefHeading___Toc8278_1352511746"/>
+      <w:bookmarkEnd w:id="64"/>
       <w:r>
         <w:rPr/>
         <w:t>Appendix B: Committee Review Checklist</w:t>
@@ -7606,10 +10240,65 @@
         <w:t>Review AI-use disclosure and final GW submission requirements.</w:t>
       </w:r>
     </w:p>
+    <w:p>
+      <w:pPr>
+        <w:pStyle w:val="Normal"/>
+        <w:rPr/>
+      </w:pPr>
+      <w:r>
+        <w:rPr/>
+      </w:r>
+      <w:r>
+        <w:br w:type="page"/>
+      </w:r>
+    </w:p>
+    <w:p>
+      <w:pPr>
+        <w:pStyle w:val="Heading1"/>
+        <w:spacing w:before="0" w:after="120"/>
+        <w:rPr/>
+      </w:pPr>
+      <w:bookmarkStart w:id="65" w:name="__RefHeading___Toc8280_1352511746"/>
+      <w:bookmarkEnd w:id="65"/>
+      <w:r>
+        <w:rPr/>
+        <w:t>Appendix C: Package Guide and Research Disclosure</w:t>
+      </w:r>
+    </w:p>
+    <w:p>
+      <w:pPr>
+        <w:pStyle w:val="Normal"/>
+        <w:rPr/>
+      </w:pPr>
+      <w:r>
+        <w:rPr/>
+        <w:t>The code package contains annotated PX-119 code, frozen PX-118 training code and its dependencies, a portable reproduction launcher, pinned numerical requirements, artifact verification and a code-section guide. Prepared source inputs are kept in a separate local private-input package. The evidence package contains protocols, predictions, result tables, qualification records, figures, audits and file hashes. Prediction files support independent metric checking without redistributing full source logs.</w:t>
+      </w:r>
+    </w:p>
+    <w:p>
+      <w:pPr>
+        <w:pStyle w:val="Normal"/>
+        <w:rPr/>
+      </w:pPr>
+      <w:r>
+        <w:rPr/>
+        <w:t>The packages distinguish completed tests from pending collection. They do not claim a public release of participant-level data or permission to redistribute original datasets. The local prepared-input bundle is for the author's reproduction workflow and must be reviewed against source terms before sharing. Serialized model files should only be loaded from the trusted package.</w:t>
+      </w:r>
+    </w:p>
+    <w:p>
+      <w:pPr>
+        <w:pStyle w:val="Normal"/>
+        <w:rPr/>
+      </w:pPr>
+      <w:r>
+        <w:rPr/>
+        <w:t>AI tools supported literature retrieval, code drafting, execution and manuscript revision. The author remains responsible for verifying claims, sources, analysis and institutional disclosure requirements. No AI-writing detector outcome or defense approval is guaranteed. Draft disclosure wording must be reviewed by the author and committee.</w:t>
+      </w:r>
+    </w:p>
     <w:sectPr>
-      <w:footerReference w:type="even" r:id="rId5"/>
-      <w:footerReference w:type="default" r:id="rId6"/>
-      <w:footerReference w:type="first" r:id="rId7"/>
+      <w:footerReference w:type="even" r:id="rId8"/>
+      <w:footerReference w:type="default" r:id="rId9"/>
+      <w:footerReference w:type="first" r:id="rId10"/>
       <w:type w:val="nextPage"/>
       <w:pgSz w:w="12240" w:h="15840"/>
       <w:pgMar w:left="1800" w:right="1800" w:gutter="0" w:header="0" w:top="1440" w:footer="720" w:bottom="1440"/>
@@ -7720,7 +10409,7 @@
     </w:r>
     <w:r>
       <w:rPr/>
-      <w:t>20</w:t>
+      <w:t>29</w:t>
     </w:r>
     <w:r>
       <w:rPr/>
@@ -7753,7 +10442,7 @@
     </w:r>
     <w:r>
       <w:rPr/>
-      <w:t>20</w:t>
+      <w:t>29</w:t>
     </w:r>
     <w:r>
       <w:rPr/>

</xml_diff>